<commit_message>
feat: land yolo26 hardcase experiments, web restyle, final report docs
- new hardcase/field-rebalance training runs, benchmarks, and
  field-recall/conf-gate audit sweeps for yolo26n/s
- training + eval scripts for hardcase datasets, stage0/1
  classifier candidates, and HF Space deploy
- web UI restyle (styles/index/app) and server tweaks
- final report, milestones, and methodology docs + workflow diagrams
</commit_message>
<xml_diff>
--- a/docs/01_final_report/WasteWise_Project_Tracking_Report.docx
+++ b/docs/01_final_report/WasteWise_Project_Tracking_Report.docx
@@ -7,7 +7,7 @@
         <w:pStyle w:val="Title"/>
       </w:pPr>
       <w:r>
-        <w:t>WasteWise Project Tracking Report</w:t>
+        <w:t>WasteWise: Project Status and Experiment Tracking Report</w:t>
       </w:r>
     </w:p>
     <w:p>
@@ -15,7 +15,7 @@
         <w:pStyle w:val="Subtitle"/>
       </w:pPr>
       <w:r>
-        <w:t>Final Year Project: automated waste classification, feature-based ML, and classification-first localization</w:t>
+        <w:t>Final Year Project: automated waste classification, feature-based ML, and localization-first classification</w:t>
       </w:r>
     </w:p>
     <w:tbl>
@@ -68,7 +68,7 @@
                 <w:color w:val="0B2545"/>
                 <w:sz w:val="20"/>
               </w:rPr>
-              <w:t>Current datasets are `external_datasets/super_yolo_dataset` for YOLO localization and `data/merged_dataset_v5` for classification. Older `merged_dataset_v3` results remain useful historical ML evidence, but they should not be described as the newest dataset.</w:t>
+              <w:t>Current datasets are `external_datasets/super_yolo_dataset` for YOLO localization and `data/merged_dataset_v5` for classification. A newest-dataset 637-feature ML rerun now exists, while older `merged_dataset_v3` results remain useful historical lecturer evidence.</w:t>
             </w:r>
           </w:p>
         </w:tc>
@@ -315,7 +315,7 @@
                 <w:b w:val="0"/>
                 <w:sz w:val="18"/>
               </w:rPr>
-              <w:t>Keep as main explainable pipeline, but rerun if all final metrics must use newest data.</w:t>
+              <w:t>Keep as main explainable pipeline; report legacy and newest-dataset evidence separately.</w:t>
             </w:r>
           </w:p>
         </w:tc>
@@ -341,7 +341,7 @@
                 <w:b w:val="0"/>
                 <w:sz w:val="18"/>
               </w:rPr>
-              <w:t>Legacy/stable lecturer artifact: 637 handcrafted features; XGBoost accuracy 0.6742, F1-macro 0.6506.</w:t>
+              <w:t>Newest super_yolo_dataset rerun: XGBoost accuracy 0.5408, F1-macro 0.3691. Legacy lecturer artifact: 0.6742 / 0.6506.</w:t>
             </w:r>
           </w:p>
         </w:tc>
@@ -393,7 +393,7 @@
                 <w:b w:val="0"/>
                 <w:sz w:val="18"/>
               </w:rPr>
-              <w:t>Completed but final claim must match artifact.</w:t>
+              <w:t>Controlled model sweep completed.</w:t>
             </w:r>
           </w:p>
         </w:tc>
@@ -418,7 +418,7 @@
                 <w:b w:val="0"/>
                 <w:sz w:val="18"/>
               </w:rPr>
-              <w:t>637 -&gt; 128 components keeps 99.90% variance; current artifact shows 4.53 pp accuracy drop.</w:t>
+              <w:t>637 -&gt; 128 keeps 99.90% variance; Linear SVM drops 62.43% -&gt; 59.90%, a 2.52 pp trade-off.</w:t>
             </w:r>
           </w:p>
         </w:tc>
@@ -575,87 +575,7 @@
                 <w:b w:val="0"/>
                 <w:sz w:val="18"/>
               </w:rPr>
-              <w:t>YOLO localization-only conf=0.35: precision 0.7614, recall 0.5134, mean IoU 0.9004.</w:t>
-            </w:r>
-          </w:p>
-        </w:tc>
-      </w:tr>
-      <w:tr>
-        <w:tc>
-          <w:tcPr>
-            <w:tcW w:type="dxa" w:w="1500"/>
-            <w:tcMar>
-              <w:top w:w="80" w:type="dxa"/>
-              <w:start w:w="120" w:type="dxa"/>
-              <w:bottom w:w="80" w:type="dxa"/>
-              <w:end w:w="120" w:type="dxa"/>
-            </w:tcMar>
-            <w:vAlign w:val="center"/>
-            <w:shd w:fill="FBFCFD"/>
-          </w:tcPr>
-          <w:p>
-            <w:pPr>
-              <w:spacing w:after="0" w:line="276" w:lineRule="auto"/>
-            </w:pPr>
-            <w:r/>
-            <w:r>
-              <w:rPr>
-                <w:b w:val="0"/>
-                <w:sz w:val="18"/>
-              </w:rPr>
-              <w:t>Mobile</w:t>
-            </w:r>
-          </w:p>
-        </w:tc>
-        <w:tc>
-          <w:tcPr>
-            <w:tcW w:type="dxa" w:w="4200"/>
-            <w:tcMar>
-              <w:top w:w="80" w:type="dxa"/>
-              <w:start w:w="120" w:type="dxa"/>
-              <w:bottom w:w="80" w:type="dxa"/>
-              <w:end w:w="120" w:type="dxa"/>
-            </w:tcMar>
-            <w:vAlign w:val="center"/>
-            <w:shd w:fill="FBFCFD"/>
-          </w:tcPr>
-          <w:p>
-            <w:pPr>
-              <w:spacing w:after="0" w:line="276" w:lineRule="auto"/>
-            </w:pPr>
-            <w:r/>
-            <w:r>
-              <w:rPr>
-                <w:b w:val="0"/>
-                <w:sz w:val="18"/>
-              </w:rPr>
-              <w:t>Implementation exists, physical validation still required.</w:t>
-            </w:r>
-          </w:p>
-        </w:tc>
-        <w:tc>
-          <w:tcPr>
-            <w:tcW w:type="dxa" w:w="3660"/>
-            <w:tcMar>
-              <w:top w:w="80" w:type="dxa"/>
-              <w:start w:w="120" w:type="dxa"/>
-              <w:bottom w:w="80" w:type="dxa"/>
-              <w:end w:w="120" w:type="dxa"/>
-            </w:tcMar>
-            <w:vAlign w:val="center"/>
-            <w:shd w:fill="FBFCFD"/>
-          </w:tcPr>
-          <w:p>
-            <w:pPr>
-              <w:spacing w:after="0" w:line="276" w:lineRule="auto"/>
-            </w:pPr>
-            <w:r/>
-            <w:r>
-              <w:rPr>
-                <w:b w:val="0"/>
-                <w:sz w:val="18"/>
-              </w:rPr>
-              <w:t>Expo app, TFLite model assets, scan/history/settings UI.</w:t>
+              <w:t>YOLO localization-only conf=0.30 on 300 images: precision 0.6999, recall 0.5729, F1 0.6301, mean IoU 0.9057.</w:t>
             </w:r>
           </w:p>
         </w:tc>
@@ -688,7 +608,7 @@
         <w:pStyle w:val="ListBullet"/>
       </w:pPr>
       <w:r>
-        <w:t>Primary DL goal after rework: perform classification first, then localize objects as a localization-only task.</w:t>
+        <w:t>Primary DL goal: perform YOLO object localization first, then verify/classify crops.</w:t>
       </w:r>
     </w:p>
     <w:p>
@@ -696,7 +616,7 @@
         <w:pStyle w:val="ListBullet"/>
       </w:pPr>
       <w:r>
-        <w:t>Deployment direction: mobile/edge-ready inference with sorting guidance, history, and settings.</w:t>
+        <w:t>Deployment direction: web-based inference with sorting guidance, history, and settings.</w:t>
       </w:r>
     </w:p>
     <w:p>
@@ -3496,7 +3416,7 @@
                 <w:color w:val="0B2545"/>
                 <w:sz w:val="20"/>
               </w:rPr>
-              <w:t>The newest YOLO dataset is imbalanced, especially in validation/test class distribution. The newest classification dataset is much more balanced and includes a Background class. Legacy ML metrics from `merged_dataset_v3` should be labelled as legacy unless rerun on the newest dataset.</w:t>
+              <w:t>The newest YOLO dataset is imbalanced, especially in validation/test class distribution. The newest classification dataset is much more balanced and includes a Background class. Legacy ML metrics from `merged_dataset_v3` are now labelled separately from the newest `super_yolo_dataset` ML rerun.</w:t>
             </w:r>
           </w:p>
         </w:tc>
@@ -3566,7 +3486,7 @@
                 <w:color w:val="0B2545"/>
                 <w:sz w:val="20"/>
               </w:rPr>
-              <w:t>The model scores below come from saved lecturer-facing artifacts, not a fresh rerun on `super_yolo_dataset` or `merged_dataset_v5`. To make the final thesis fully newest-dataset-aligned, rerun feature extraction and ML model comparison on the newest selected dataset.</w:t>
+              <w:t>There are now two ML evidence tracks: the stronger lecturer-facing legacy run on `merged_dataset_v3`, and a newest-dataset rerun on `super_yolo_dataset`. Use the newest run when answering dataset-version questions; use the legacy run as historical evidence only.</w:t>
             </w:r>
           </w:p>
         </w:tc>
@@ -4074,6 +3994,836 @@
                 <w:sz w:val="18"/>
               </w:rPr>
               <w:t>Fixed handcrafted representation for explainable ML.</w:t>
+            </w:r>
+          </w:p>
+        </w:tc>
+      </w:tr>
+    </w:tbl>
+    <w:p/>
+    <w:tbl>
+      <w:tblPr>
+        <w:tblStyle w:val="TableGrid"/>
+        <w:tblW w:type="dxa" w:w="9360"/>
+        <w:jc w:val="left"/>
+        <w:tblLook w:firstColumn="1" w:firstRow="1" w:lastColumn="0" w:lastRow="0" w:noHBand="0" w:noVBand="1" w:val="04A0"/>
+        <w:tblInd w:w="120" w:type="dxa"/>
+      </w:tblPr>
+      <w:tblGrid>
+        <w:gridCol w:w="2500"/>
+        <w:gridCol w:w="1400"/>
+        <w:gridCol w:w="1400"/>
+        <w:gridCol w:w="4060"/>
+      </w:tblGrid>
+      <w:tr>
+        <w:trPr>
+          <w:tblHeader w:val="true"/>
+        </w:trPr>
+        <w:tc>
+          <w:tcPr>
+            <w:tcW w:type="dxa" w:w="2500"/>
+            <w:tcMar>
+              <w:top w:w="80" w:type="dxa"/>
+              <w:start w:w="120" w:type="dxa"/>
+              <w:bottom w:w="80" w:type="dxa"/>
+              <w:end w:w="120" w:type="dxa"/>
+            </w:tcMar>
+            <w:vAlign w:val="center"/>
+            <w:shd w:fill="E8EEF5"/>
+          </w:tcPr>
+          <w:p>
+            <w:pPr>
+              <w:spacing w:after="0" w:line="276" w:lineRule="auto"/>
+            </w:pPr>
+            <w:r>
+              <w:rPr>
+                <w:b/>
+                <w:color w:val="0B2545"/>
+              </w:rPr>
+            </w:r>
+            <w:r>
+              <w:rPr>
+                <w:b/>
+                <w:color w:val="0B2545"/>
+                <w:sz w:val="18"/>
+              </w:rPr>
+              <w:t>Current-dataset model</w:t>
+            </w:r>
+          </w:p>
+        </w:tc>
+        <w:tc>
+          <w:tcPr>
+            <w:tcW w:type="dxa" w:w="1400"/>
+            <w:tcMar>
+              <w:top w:w="80" w:type="dxa"/>
+              <w:start w:w="120" w:type="dxa"/>
+              <w:bottom w:w="80" w:type="dxa"/>
+              <w:end w:w="120" w:type="dxa"/>
+            </w:tcMar>
+            <w:vAlign w:val="center"/>
+            <w:shd w:fill="E8EEF5"/>
+          </w:tcPr>
+          <w:p>
+            <w:pPr>
+              <w:spacing w:after="0" w:line="276" w:lineRule="auto"/>
+            </w:pPr>
+            <w:r>
+              <w:rPr>
+                <w:b/>
+                <w:color w:val="0B2545"/>
+              </w:rPr>
+            </w:r>
+            <w:r>
+              <w:rPr>
+                <w:b/>
+                <w:color w:val="0B2545"/>
+                <w:sz w:val="18"/>
+              </w:rPr>
+              <w:t>Accuracy</w:t>
+            </w:r>
+          </w:p>
+        </w:tc>
+        <w:tc>
+          <w:tcPr>
+            <w:tcW w:type="dxa" w:w="1400"/>
+            <w:tcMar>
+              <w:top w:w="80" w:type="dxa"/>
+              <w:start w:w="120" w:type="dxa"/>
+              <w:bottom w:w="80" w:type="dxa"/>
+              <w:end w:w="120" w:type="dxa"/>
+            </w:tcMar>
+            <w:vAlign w:val="center"/>
+            <w:shd w:fill="E8EEF5"/>
+          </w:tcPr>
+          <w:p>
+            <w:pPr>
+              <w:spacing w:after="0" w:line="276" w:lineRule="auto"/>
+            </w:pPr>
+            <w:r>
+              <w:rPr>
+                <w:b/>
+                <w:color w:val="0B2545"/>
+              </w:rPr>
+            </w:r>
+            <w:r>
+              <w:rPr>
+                <w:b/>
+                <w:color w:val="0B2545"/>
+                <w:sz w:val="18"/>
+              </w:rPr>
+              <w:t>F1-macro</w:t>
+            </w:r>
+          </w:p>
+        </w:tc>
+        <w:tc>
+          <w:tcPr>
+            <w:tcW w:type="dxa" w:w="4060"/>
+            <w:tcMar>
+              <w:top w:w="80" w:type="dxa"/>
+              <w:start w:w="120" w:type="dxa"/>
+              <w:bottom w:w="80" w:type="dxa"/>
+              <w:end w:w="120" w:type="dxa"/>
+            </w:tcMar>
+            <w:vAlign w:val="center"/>
+            <w:shd w:fill="E8EEF5"/>
+          </w:tcPr>
+          <w:p>
+            <w:pPr>
+              <w:spacing w:after="0" w:line="276" w:lineRule="auto"/>
+            </w:pPr>
+            <w:r>
+              <w:rPr>
+                <w:b/>
+                <w:color w:val="0B2545"/>
+              </w:rPr>
+            </w:r>
+            <w:r>
+              <w:rPr>
+                <w:b/>
+                <w:color w:val="0B2545"/>
+                <w:sz w:val="18"/>
+              </w:rPr>
+              <w:t>Decision</w:t>
+            </w:r>
+          </w:p>
+        </w:tc>
+      </w:tr>
+      <w:tr>
+        <w:tc>
+          <w:tcPr>
+            <w:tcW w:type="dxa" w:w="2500"/>
+            <w:tcMar>
+              <w:top w:w="80" w:type="dxa"/>
+              <w:start w:w="120" w:type="dxa"/>
+              <w:bottom w:w="80" w:type="dxa"/>
+              <w:end w:w="120" w:type="dxa"/>
+            </w:tcMar>
+            <w:vAlign w:val="center"/>
+          </w:tcPr>
+          <w:p>
+            <w:pPr>
+              <w:spacing w:after="0" w:line="276" w:lineRule="auto"/>
+            </w:pPr>
+            <w:r/>
+            <w:r>
+              <w:rPr>
+                <w:b w:val="0"/>
+                <w:sz w:val="18"/>
+              </w:rPr>
+              <w:t>XGBoost</w:t>
+            </w:r>
+          </w:p>
+        </w:tc>
+        <w:tc>
+          <w:tcPr>
+            <w:tcW w:type="dxa" w:w="1400"/>
+            <w:tcMar>
+              <w:top w:w="80" w:type="dxa"/>
+              <w:start w:w="120" w:type="dxa"/>
+              <w:bottom w:w="80" w:type="dxa"/>
+              <w:end w:w="120" w:type="dxa"/>
+            </w:tcMar>
+            <w:vAlign w:val="center"/>
+          </w:tcPr>
+          <w:p>
+            <w:pPr>
+              <w:spacing w:after="0" w:line="276" w:lineRule="auto"/>
+            </w:pPr>
+            <w:r/>
+            <w:r>
+              <w:rPr>
+                <w:b w:val="0"/>
+                <w:sz w:val="18"/>
+              </w:rPr>
+              <w:t>0.5408</w:t>
+            </w:r>
+          </w:p>
+        </w:tc>
+        <w:tc>
+          <w:tcPr>
+            <w:tcW w:type="dxa" w:w="1400"/>
+            <w:tcMar>
+              <w:top w:w="80" w:type="dxa"/>
+              <w:start w:w="120" w:type="dxa"/>
+              <w:bottom w:w="80" w:type="dxa"/>
+              <w:end w:w="120" w:type="dxa"/>
+            </w:tcMar>
+            <w:vAlign w:val="center"/>
+          </w:tcPr>
+          <w:p>
+            <w:pPr>
+              <w:spacing w:after="0" w:line="276" w:lineRule="auto"/>
+            </w:pPr>
+            <w:r/>
+            <w:r>
+              <w:rPr>
+                <w:b w:val="0"/>
+                <w:sz w:val="18"/>
+              </w:rPr>
+              <w:t>0.3691</w:t>
+            </w:r>
+          </w:p>
+        </w:tc>
+        <w:tc>
+          <w:tcPr>
+            <w:tcW w:type="dxa" w:w="4060"/>
+            <w:tcMar>
+              <w:top w:w="80" w:type="dxa"/>
+              <w:start w:w="120" w:type="dxa"/>
+              <w:bottom w:w="80" w:type="dxa"/>
+              <w:end w:w="120" w:type="dxa"/>
+            </w:tcMar>
+            <w:vAlign w:val="center"/>
+          </w:tcPr>
+          <w:p>
+            <w:pPr>
+              <w:spacing w:after="0" w:line="276" w:lineRule="auto"/>
+            </w:pPr>
+            <w:r/>
+            <w:r>
+              <w:rPr>
+                <w:b w:val="0"/>
+                <w:sz w:val="18"/>
+              </w:rPr>
+              <w:t>Best on newest `super_yolo_dataset` rerun.</w:t>
+            </w:r>
+          </w:p>
+        </w:tc>
+      </w:tr>
+      <w:tr>
+        <w:tc>
+          <w:tcPr>
+            <w:tcW w:type="dxa" w:w="2500"/>
+            <w:tcMar>
+              <w:top w:w="80" w:type="dxa"/>
+              <w:start w:w="120" w:type="dxa"/>
+              <w:bottom w:w="80" w:type="dxa"/>
+              <w:end w:w="120" w:type="dxa"/>
+            </w:tcMar>
+            <w:vAlign w:val="center"/>
+            <w:shd w:fill="FBFCFD"/>
+          </w:tcPr>
+          <w:p>
+            <w:pPr>
+              <w:spacing w:after="0" w:line="276" w:lineRule="auto"/>
+            </w:pPr>
+            <w:r/>
+            <w:r>
+              <w:rPr>
+                <w:b w:val="0"/>
+                <w:sz w:val="18"/>
+              </w:rPr>
+              <w:t>Random Forest</w:t>
+            </w:r>
+          </w:p>
+        </w:tc>
+        <w:tc>
+          <w:tcPr>
+            <w:tcW w:type="dxa" w:w="1400"/>
+            <w:tcMar>
+              <w:top w:w="80" w:type="dxa"/>
+              <w:start w:w="120" w:type="dxa"/>
+              <w:bottom w:w="80" w:type="dxa"/>
+              <w:end w:w="120" w:type="dxa"/>
+            </w:tcMar>
+            <w:vAlign w:val="center"/>
+            <w:shd w:fill="FBFCFD"/>
+          </w:tcPr>
+          <w:p>
+            <w:pPr>
+              <w:spacing w:after="0" w:line="276" w:lineRule="auto"/>
+            </w:pPr>
+            <w:r/>
+            <w:r>
+              <w:rPr>
+                <w:b w:val="0"/>
+                <w:sz w:val="18"/>
+              </w:rPr>
+              <w:t>0.5063</w:t>
+            </w:r>
+          </w:p>
+        </w:tc>
+        <w:tc>
+          <w:tcPr>
+            <w:tcW w:type="dxa" w:w="1400"/>
+            <w:tcMar>
+              <w:top w:w="80" w:type="dxa"/>
+              <w:start w:w="120" w:type="dxa"/>
+              <w:bottom w:w="80" w:type="dxa"/>
+              <w:end w:w="120" w:type="dxa"/>
+            </w:tcMar>
+            <w:vAlign w:val="center"/>
+            <w:shd w:fill="FBFCFD"/>
+          </w:tcPr>
+          <w:p>
+            <w:pPr>
+              <w:spacing w:after="0" w:line="276" w:lineRule="auto"/>
+            </w:pPr>
+            <w:r/>
+            <w:r>
+              <w:rPr>
+                <w:b w:val="0"/>
+                <w:sz w:val="18"/>
+              </w:rPr>
+              <w:t>0.3456</w:t>
+            </w:r>
+          </w:p>
+        </w:tc>
+        <w:tc>
+          <w:tcPr>
+            <w:tcW w:type="dxa" w:w="4060"/>
+            <w:tcMar>
+              <w:top w:w="80" w:type="dxa"/>
+              <w:start w:w="120" w:type="dxa"/>
+              <w:bottom w:w="80" w:type="dxa"/>
+              <w:end w:w="120" w:type="dxa"/>
+            </w:tcMar>
+            <w:vAlign w:val="center"/>
+            <w:shd w:fill="FBFCFD"/>
+          </w:tcPr>
+          <w:p>
+            <w:pPr>
+              <w:spacing w:after="0" w:line="276" w:lineRule="auto"/>
+            </w:pPr>
+            <w:r/>
+            <w:r>
+              <w:rPr>
+                <w:b w:val="0"/>
+                <w:sz w:val="18"/>
+              </w:rPr>
+              <w:t>Tree baseline with feature importance chart.</w:t>
+            </w:r>
+          </w:p>
+        </w:tc>
+      </w:tr>
+      <w:tr>
+        <w:tc>
+          <w:tcPr>
+            <w:tcW w:type="dxa" w:w="2500"/>
+            <w:tcMar>
+              <w:top w:w="80" w:type="dxa"/>
+              <w:start w:w="120" w:type="dxa"/>
+              <w:bottom w:w="80" w:type="dxa"/>
+              <w:end w:w="120" w:type="dxa"/>
+            </w:tcMar>
+            <w:vAlign w:val="center"/>
+          </w:tcPr>
+          <w:p>
+            <w:pPr>
+              <w:spacing w:after="0" w:line="276" w:lineRule="auto"/>
+            </w:pPr>
+            <w:r/>
+            <w:r>
+              <w:rPr>
+                <w:b w:val="0"/>
+                <w:sz w:val="18"/>
+              </w:rPr>
+              <w:t>ExtraTrees</w:t>
+            </w:r>
+          </w:p>
+        </w:tc>
+        <w:tc>
+          <w:tcPr>
+            <w:tcW w:type="dxa" w:w="1400"/>
+            <w:tcMar>
+              <w:top w:w="80" w:type="dxa"/>
+              <w:start w:w="120" w:type="dxa"/>
+              <w:bottom w:w="80" w:type="dxa"/>
+              <w:end w:w="120" w:type="dxa"/>
+            </w:tcMar>
+            <w:vAlign w:val="center"/>
+          </w:tcPr>
+          <w:p>
+            <w:pPr>
+              <w:spacing w:after="0" w:line="276" w:lineRule="auto"/>
+            </w:pPr>
+            <w:r/>
+            <w:r>
+              <w:rPr>
+                <w:b w:val="0"/>
+                <w:sz w:val="18"/>
+              </w:rPr>
+              <w:t>0.5045</w:t>
+            </w:r>
+          </w:p>
+        </w:tc>
+        <w:tc>
+          <w:tcPr>
+            <w:tcW w:type="dxa" w:w="1400"/>
+            <w:tcMar>
+              <w:top w:w="80" w:type="dxa"/>
+              <w:start w:w="120" w:type="dxa"/>
+              <w:bottom w:w="80" w:type="dxa"/>
+              <w:end w:w="120" w:type="dxa"/>
+            </w:tcMar>
+            <w:vAlign w:val="center"/>
+          </w:tcPr>
+          <w:p>
+            <w:pPr>
+              <w:spacing w:after="0" w:line="276" w:lineRule="auto"/>
+            </w:pPr>
+            <w:r/>
+            <w:r>
+              <w:rPr>
+                <w:b w:val="0"/>
+                <w:sz w:val="18"/>
+              </w:rPr>
+              <w:t>0.3414</w:t>
+            </w:r>
+          </w:p>
+        </w:tc>
+        <w:tc>
+          <w:tcPr>
+            <w:tcW w:type="dxa" w:w="4060"/>
+            <w:tcMar>
+              <w:top w:w="80" w:type="dxa"/>
+              <w:start w:w="120" w:type="dxa"/>
+              <w:bottom w:w="80" w:type="dxa"/>
+              <w:end w:w="120" w:type="dxa"/>
+            </w:tcMar>
+            <w:vAlign w:val="center"/>
+          </w:tcPr>
+          <w:p>
+            <w:pPr>
+              <w:spacing w:after="0" w:line="276" w:lineRule="auto"/>
+            </w:pPr>
+            <w:r/>
+            <w:r>
+              <w:rPr>
+                <w:b w:val="0"/>
+                <w:sz w:val="18"/>
+              </w:rPr>
+              <w:t>Close to RF on newest data.</w:t>
+            </w:r>
+          </w:p>
+        </w:tc>
+      </w:tr>
+      <w:tr>
+        <w:tc>
+          <w:tcPr>
+            <w:tcW w:type="dxa" w:w="2500"/>
+            <w:tcMar>
+              <w:top w:w="80" w:type="dxa"/>
+              <w:start w:w="120" w:type="dxa"/>
+              <w:bottom w:w="80" w:type="dxa"/>
+              <w:end w:w="120" w:type="dxa"/>
+            </w:tcMar>
+            <w:vAlign w:val="center"/>
+            <w:shd w:fill="FBFCFD"/>
+          </w:tcPr>
+          <w:p>
+            <w:pPr>
+              <w:spacing w:after="0" w:line="276" w:lineRule="auto"/>
+            </w:pPr>
+            <w:r/>
+            <w:r>
+              <w:rPr>
+                <w:b w:val="0"/>
+                <w:sz w:val="18"/>
+              </w:rPr>
+              <w:t>Linear SVM</w:t>
+            </w:r>
+          </w:p>
+        </w:tc>
+        <w:tc>
+          <w:tcPr>
+            <w:tcW w:type="dxa" w:w="1400"/>
+            <w:tcMar>
+              <w:top w:w="80" w:type="dxa"/>
+              <w:start w:w="120" w:type="dxa"/>
+              <w:bottom w:w="80" w:type="dxa"/>
+              <w:end w:w="120" w:type="dxa"/>
+            </w:tcMar>
+            <w:vAlign w:val="center"/>
+            <w:shd w:fill="FBFCFD"/>
+          </w:tcPr>
+          <w:p>
+            <w:pPr>
+              <w:spacing w:after="0" w:line="276" w:lineRule="auto"/>
+            </w:pPr>
+            <w:r/>
+            <w:r>
+              <w:rPr>
+                <w:b w:val="0"/>
+                <w:sz w:val="18"/>
+              </w:rPr>
+              <w:t>0.4628</w:t>
+            </w:r>
+          </w:p>
+        </w:tc>
+        <w:tc>
+          <w:tcPr>
+            <w:tcW w:type="dxa" w:w="1400"/>
+            <w:tcMar>
+              <w:top w:w="80" w:type="dxa"/>
+              <w:start w:w="120" w:type="dxa"/>
+              <w:bottom w:w="80" w:type="dxa"/>
+              <w:end w:w="120" w:type="dxa"/>
+            </w:tcMar>
+            <w:vAlign w:val="center"/>
+            <w:shd w:fill="FBFCFD"/>
+          </w:tcPr>
+          <w:p>
+            <w:pPr>
+              <w:spacing w:after="0" w:line="276" w:lineRule="auto"/>
+            </w:pPr>
+            <w:r/>
+            <w:r>
+              <w:rPr>
+                <w:b w:val="0"/>
+                <w:sz w:val="18"/>
+              </w:rPr>
+              <w:t>0.3159</w:t>
+            </w:r>
+          </w:p>
+        </w:tc>
+        <w:tc>
+          <w:tcPr>
+            <w:tcW w:type="dxa" w:w="4060"/>
+            <w:tcMar>
+              <w:top w:w="80" w:type="dxa"/>
+              <w:start w:w="120" w:type="dxa"/>
+              <w:bottom w:w="80" w:type="dxa"/>
+              <w:end w:w="120" w:type="dxa"/>
+            </w:tcMar>
+            <w:vAlign w:val="center"/>
+            <w:shd w:fill="FBFCFD"/>
+          </w:tcPr>
+          <w:p>
+            <w:pPr>
+              <w:spacing w:after="0" w:line="276" w:lineRule="auto"/>
+            </w:pPr>
+            <w:r/>
+            <w:r>
+              <w:rPr>
+                <w:b w:val="0"/>
+                <w:sz w:val="18"/>
+              </w:rPr>
+              <w:t>Margin-based baseline.</w:t>
+            </w:r>
+          </w:p>
+        </w:tc>
+      </w:tr>
+      <w:tr>
+        <w:tc>
+          <w:tcPr>
+            <w:tcW w:type="dxa" w:w="2500"/>
+            <w:tcMar>
+              <w:top w:w="80" w:type="dxa"/>
+              <w:start w:w="120" w:type="dxa"/>
+              <w:bottom w:w="80" w:type="dxa"/>
+              <w:end w:w="120" w:type="dxa"/>
+            </w:tcMar>
+            <w:vAlign w:val="center"/>
+          </w:tcPr>
+          <w:p>
+            <w:pPr>
+              <w:spacing w:after="0" w:line="276" w:lineRule="auto"/>
+            </w:pPr>
+            <w:r/>
+            <w:r>
+              <w:rPr>
+                <w:b w:val="0"/>
+                <w:sz w:val="18"/>
+              </w:rPr>
+              <w:t>Logistic Regression</w:t>
+            </w:r>
+          </w:p>
+        </w:tc>
+        <w:tc>
+          <w:tcPr>
+            <w:tcW w:type="dxa" w:w="1400"/>
+            <w:tcMar>
+              <w:top w:w="80" w:type="dxa"/>
+              <w:start w:w="120" w:type="dxa"/>
+              <w:bottom w:w="80" w:type="dxa"/>
+              <w:end w:w="120" w:type="dxa"/>
+            </w:tcMar>
+            <w:vAlign w:val="center"/>
+          </w:tcPr>
+          <w:p>
+            <w:pPr>
+              <w:spacing w:after="0" w:line="276" w:lineRule="auto"/>
+            </w:pPr>
+            <w:r/>
+            <w:r>
+              <w:rPr>
+                <w:b w:val="0"/>
+                <w:sz w:val="18"/>
+              </w:rPr>
+              <w:t>0.4494</w:t>
+            </w:r>
+          </w:p>
+        </w:tc>
+        <w:tc>
+          <w:tcPr>
+            <w:tcW w:type="dxa" w:w="1400"/>
+            <w:tcMar>
+              <w:top w:w="80" w:type="dxa"/>
+              <w:start w:w="120" w:type="dxa"/>
+              <w:bottom w:w="80" w:type="dxa"/>
+              <w:end w:w="120" w:type="dxa"/>
+            </w:tcMar>
+            <w:vAlign w:val="center"/>
+          </w:tcPr>
+          <w:p>
+            <w:pPr>
+              <w:spacing w:after="0" w:line="276" w:lineRule="auto"/>
+            </w:pPr>
+            <w:r/>
+            <w:r>
+              <w:rPr>
+                <w:b w:val="0"/>
+                <w:sz w:val="18"/>
+              </w:rPr>
+              <w:t>0.3054</w:t>
+            </w:r>
+          </w:p>
+        </w:tc>
+        <w:tc>
+          <w:tcPr>
+            <w:tcW w:type="dxa" w:w="4060"/>
+            <w:tcMar>
+              <w:top w:w="80" w:type="dxa"/>
+              <w:start w:w="120" w:type="dxa"/>
+              <w:bottom w:w="80" w:type="dxa"/>
+              <w:end w:w="120" w:type="dxa"/>
+            </w:tcMar>
+            <w:vAlign w:val="center"/>
+          </w:tcPr>
+          <w:p>
+            <w:pPr>
+              <w:spacing w:after="0" w:line="276" w:lineRule="auto"/>
+            </w:pPr>
+            <w:r/>
+            <w:r>
+              <w:rPr>
+                <w:b w:val="0"/>
+                <w:sz w:val="18"/>
+              </w:rPr>
+              <w:t>Linear standardized baseline.</w:t>
+            </w:r>
+          </w:p>
+        </w:tc>
+      </w:tr>
+      <w:tr>
+        <w:tc>
+          <w:tcPr>
+            <w:tcW w:type="dxa" w:w="2500"/>
+            <w:tcMar>
+              <w:top w:w="80" w:type="dxa"/>
+              <w:start w:w="120" w:type="dxa"/>
+              <w:bottom w:w="80" w:type="dxa"/>
+              <w:end w:w="120" w:type="dxa"/>
+            </w:tcMar>
+            <w:vAlign w:val="center"/>
+            <w:shd w:fill="FBFCFD"/>
+          </w:tcPr>
+          <w:p>
+            <w:pPr>
+              <w:spacing w:after="0" w:line="276" w:lineRule="auto"/>
+            </w:pPr>
+            <w:r/>
+            <w:r>
+              <w:rPr>
+                <w:b w:val="0"/>
+                <w:sz w:val="18"/>
+              </w:rPr>
+              <w:t>Decision Tree</w:t>
+            </w:r>
+          </w:p>
+        </w:tc>
+        <w:tc>
+          <w:tcPr>
+            <w:tcW w:type="dxa" w:w="1400"/>
+            <w:tcMar>
+              <w:top w:w="80" w:type="dxa"/>
+              <w:start w:w="120" w:type="dxa"/>
+              <w:bottom w:w="80" w:type="dxa"/>
+              <w:end w:w="120" w:type="dxa"/>
+            </w:tcMar>
+            <w:vAlign w:val="center"/>
+            <w:shd w:fill="FBFCFD"/>
+          </w:tcPr>
+          <w:p>
+            <w:pPr>
+              <w:spacing w:after="0" w:line="276" w:lineRule="auto"/>
+            </w:pPr>
+            <w:r/>
+            <w:r>
+              <w:rPr>
+                <w:b w:val="0"/>
+                <w:sz w:val="18"/>
+              </w:rPr>
+              <w:t>0.3750</w:t>
+            </w:r>
+          </w:p>
+        </w:tc>
+        <w:tc>
+          <w:tcPr>
+            <w:tcW w:type="dxa" w:w="1400"/>
+            <w:tcMar>
+              <w:top w:w="80" w:type="dxa"/>
+              <w:start w:w="120" w:type="dxa"/>
+              <w:bottom w:w="80" w:type="dxa"/>
+              <w:end w:w="120" w:type="dxa"/>
+            </w:tcMar>
+            <w:vAlign w:val="center"/>
+            <w:shd w:fill="FBFCFD"/>
+          </w:tcPr>
+          <w:p>
+            <w:pPr>
+              <w:spacing w:after="0" w:line="276" w:lineRule="auto"/>
+            </w:pPr>
+            <w:r/>
+            <w:r>
+              <w:rPr>
+                <w:b w:val="0"/>
+                <w:sz w:val="18"/>
+              </w:rPr>
+              <w:t>0.2631</w:t>
+            </w:r>
+          </w:p>
+        </w:tc>
+        <w:tc>
+          <w:tcPr>
+            <w:tcW w:type="dxa" w:w="4060"/>
+            <w:tcMar>
+              <w:top w:w="80" w:type="dxa"/>
+              <w:start w:w="120" w:type="dxa"/>
+              <w:bottom w:w="80" w:type="dxa"/>
+              <w:end w:w="120" w:type="dxa"/>
+            </w:tcMar>
+            <w:vAlign w:val="center"/>
+            <w:shd w:fill="FBFCFD"/>
+          </w:tcPr>
+          <w:p>
+            <w:pPr>
+              <w:spacing w:after="0" w:line="276" w:lineRule="auto"/>
+            </w:pPr>
+            <w:r/>
+            <w:r>
+              <w:rPr>
+                <w:b w:val="0"/>
+                <w:sz w:val="18"/>
+              </w:rPr>
+              <w:t>Simple interpretable baseline.</w:t>
+            </w:r>
+          </w:p>
+        </w:tc>
+      </w:tr>
+    </w:tbl>
+    <w:p/>
+    <w:tbl>
+      <w:tblPr>
+        <w:tblStyle w:val="TableGrid"/>
+        <w:tblW w:type="dxa" w:w="9360"/>
+        <w:jc w:val="left"/>
+        <w:tblLook w:firstColumn="1" w:firstRow="1" w:lastColumn="0" w:lastRow="0" w:noHBand="0" w:noVBand="1" w:val="04A0"/>
+        <w:tblInd w:w="120" w:type="dxa"/>
+      </w:tblPr>
+      <w:tblGrid>
+        <w:gridCol w:w="9360"/>
+      </w:tblGrid>
+      <w:tr>
+        <w:trPr>
+          <w:tblHeader w:val="true"/>
+        </w:trPr>
+        <w:tc>
+          <w:tcPr>
+            <w:tcW w:type="dxa" w:w="9360"/>
+            <w:shd w:fill="FFF7DF"/>
+            <w:tcMar>
+              <w:top w:w="80" w:type="dxa"/>
+              <w:start w:w="120" w:type="dxa"/>
+              <w:bottom w:w="80" w:type="dxa"/>
+              <w:end w:w="120" w:type="dxa"/>
+            </w:tcMar>
+            <w:vAlign w:val="center"/>
+          </w:tcPr>
+          <w:p>
+            <w:pPr>
+              <w:spacing w:after="60"/>
+            </w:pPr>
+            <w:r>
+              <w:rPr>
+                <w:b/>
+                <w:color w:val="0B2545"/>
+                <w:sz w:val="22"/>
+              </w:rPr>
+              <w:t>Newest ML support warning</w:t>
+            </w:r>
+          </w:p>
+          <w:p>
+            <w:pPr>
+              <w:spacing w:after="0" w:line="276" w:lineRule="auto"/>
+            </w:pPr>
+            <w:r>
+              <w:rPr>
+                <w:b/>
+                <w:color w:val="0B2545"/>
+                <w:sz w:val="20"/>
+              </w:rPr>
+              <w:t>The newest ML rerun used 24,000 train crops, but only 2,232 test crops because the test split has very low support for glass (9), cardboard (35), and organic (46). Report the lower F1 as current-dataset evidence under test imbalance, not as a balanced benchmark.</w:t>
             </w:r>
           </w:p>
         </w:tc>
@@ -4126,7 +4876,7 @@
                 <w:color w:val="0B2545"/>
                 <w:sz w:val="18"/>
               </w:rPr>
-              <w:t>Model</w:t>
+              <w:t>Legacy lecturer model</w:t>
             </w:r>
           </w:p>
         </w:tc>
@@ -5198,7 +5948,7 @@
           <w:color w:val="555555"/>
           <w:sz w:val="18"/>
         </w:rPr>
-        <w:t>Figure 1. Classical ML model comparison.</w:t>
+        <w:t>Figure 1. Current-dataset classical ML model comparison.</w:t>
       </w:r>
     </w:p>
     <w:p>
@@ -5251,7 +6001,7 @@
           <w:color w:val="555555"/>
           <w:sz w:val="18"/>
         </w:rPr>
-        <w:t>Figure 2. Feature group / domain importance.</w:t>
+        <w:t>Figure 2. Current-dataset feature group / domain importance.</w:t>
       </w:r>
     </w:p>
     <w:p>
@@ -5265,17 +6015,18 @@
     <w:tbl>
       <w:tblPr>
         <w:tblStyle w:val="TableGrid"/>
-        <w:tblW w:type="dxa" w:w="9360"/>
+        <w:tblW w:type="dxa" w:w="9460"/>
         <w:jc w:val="left"/>
         <w:tblLook w:firstColumn="1" w:firstRow="1" w:lastColumn="0" w:lastRow="0" w:noHBand="0" w:noVBand="1" w:val="04A0"/>
         <w:tblInd w:w="120" w:type="dxa"/>
       </w:tblPr>
       <w:tblGrid>
-        <w:gridCol w:w="1700"/>
         <w:gridCol w:w="2300"/>
-        <w:gridCol w:w="1600"/>
-        <w:gridCol w:w="1800"/>
-        <w:gridCol w:w="1960"/>
+        <w:gridCol w:w="2100"/>
+        <w:gridCol w:w="1300"/>
+        <w:gridCol w:w="1300"/>
+        <w:gridCol w:w="1200"/>
+        <w:gridCol w:w="1260"/>
       </w:tblGrid>
       <w:tr>
         <w:trPr>
@@ -5283,7 +6034,7 @@
         </w:trPr>
         <w:tc>
           <w:tcPr>
-            <w:tcW w:type="dxa" w:w="1700"/>
+            <w:tcW w:type="dxa" w:w="2300"/>
             <w:tcMar>
               <w:top w:w="80" w:type="dxa"/>
               <w:start w:w="120" w:type="dxa"/>
@@ -5309,13 +6060,13 @@
                 <w:color w:val="0B2545"/>
                 <w:sz w:val="18"/>
               </w:rPr>
-              <w:t>Components</w:t>
-            </w:r>
-          </w:p>
-        </w:tc>
-        <w:tc>
-          <w:tcPr>
-            <w:tcW w:type="dxa" w:w="2300"/>
+              <w:t>Evidence</w:t>
+            </w:r>
+          </w:p>
+        </w:tc>
+        <w:tc>
+          <w:tcPr>
+            <w:tcW w:type="dxa" w:w="2100"/>
             <w:tcMar>
               <w:top w:w="80" w:type="dxa"/>
               <w:start w:w="120" w:type="dxa"/>
@@ -5341,13 +6092,13 @@
                 <w:color w:val="0B2545"/>
                 <w:sz w:val="18"/>
               </w:rPr>
-              <w:t>Explained variance</w:t>
-            </w:r>
-          </w:p>
-        </w:tc>
-        <w:tc>
-          <w:tcPr>
-            <w:tcW w:type="dxa" w:w="1600"/>
+              <w:t>Model</w:t>
+            </w:r>
+          </w:p>
+        </w:tc>
+        <w:tc>
+          <w:tcPr>
+            <w:tcW w:type="dxa" w:w="1300"/>
             <w:tcMar>
               <w:top w:w="80" w:type="dxa"/>
               <w:start w:w="120" w:type="dxa"/>
@@ -5373,13 +6124,13 @@
                 <w:color w:val="0B2545"/>
                 <w:sz w:val="18"/>
               </w:rPr>
-              <w:t>Accuracy</w:t>
-            </w:r>
-          </w:p>
-        </w:tc>
-        <w:tc>
-          <w:tcPr>
-            <w:tcW w:type="dxa" w:w="1800"/>
+              <w:t>Components</w:t>
+            </w:r>
+          </w:p>
+        </w:tc>
+        <w:tc>
+          <w:tcPr>
+            <w:tcW w:type="dxa" w:w="1300"/>
             <w:tcMar>
               <w:top w:w="80" w:type="dxa"/>
               <w:start w:w="120" w:type="dxa"/>
@@ -5405,13 +6156,13 @@
                 <w:color w:val="0B2545"/>
                 <w:sz w:val="18"/>
               </w:rPr>
-              <w:t>Weighted F1</w:t>
-            </w:r>
-          </w:p>
-        </w:tc>
-        <w:tc>
-          <w:tcPr>
-            <w:tcW w:type="dxa" w:w="1960"/>
+              <w:t>Accuracy</w:t>
+            </w:r>
+          </w:p>
+        </w:tc>
+        <w:tc>
+          <w:tcPr>
+            <w:tcW w:type="dxa" w:w="1200"/>
             <w:tcMar>
               <w:top w:w="80" w:type="dxa"/>
               <w:start w:w="120" w:type="dxa"/>
@@ -5437,7 +6188,39 @@
                 <w:color w:val="0B2545"/>
                 <w:sz w:val="18"/>
               </w:rPr>
-              <w:t>Latency</w:t>
+              <w:t>F1</w:t>
+            </w:r>
+          </w:p>
+        </w:tc>
+        <w:tc>
+          <w:tcPr>
+            <w:tcW w:type="dxa" w:w="1260"/>
+            <w:tcMar>
+              <w:top w:w="80" w:type="dxa"/>
+              <w:start w:w="120" w:type="dxa"/>
+              <w:bottom w:w="80" w:type="dxa"/>
+              <w:end w:w="120" w:type="dxa"/>
+            </w:tcMar>
+            <w:vAlign w:val="center"/>
+            <w:shd w:fill="E8EEF5"/>
+          </w:tcPr>
+          <w:p>
+            <w:pPr>
+              <w:spacing w:after="0" w:line="276" w:lineRule="auto"/>
+            </w:pPr>
+            <w:r>
+              <w:rPr>
+                <w:b/>
+                <w:color w:val="0B2545"/>
+              </w:rPr>
+            </w:r>
+            <w:r>
+              <w:rPr>
+                <w:b/>
+                <w:color w:val="0B2545"/>
+                <w:sz w:val="18"/>
+              </w:rPr>
+              <w:t>Drop</w:t>
             </w:r>
           </w:p>
         </w:tc>
@@ -5445,7 +6228,7 @@
       <w:tr>
         <w:tc>
           <w:tcPr>
-            <w:tcW w:type="dxa" w:w="1700"/>
+            <w:tcW w:type="dxa" w:w="2300"/>
             <w:tcMar>
               <w:top w:w="80" w:type="dxa"/>
               <w:start w:w="120" w:type="dxa"/>
@@ -5464,13 +6247,63 @@
                 <w:b w:val="0"/>
                 <w:sz w:val="18"/>
               </w:rPr>
+              <w:t>Controlled ML sweep</w:t>
+            </w:r>
+          </w:p>
+        </w:tc>
+        <w:tc>
+          <w:tcPr>
+            <w:tcW w:type="dxa" w:w="2100"/>
+            <w:tcMar>
+              <w:top w:w="80" w:type="dxa"/>
+              <w:start w:w="120" w:type="dxa"/>
+              <w:bottom w:w="80" w:type="dxa"/>
+              <w:end w:w="120" w:type="dxa"/>
+            </w:tcMar>
+            <w:vAlign w:val="center"/>
+          </w:tcPr>
+          <w:p>
+            <w:pPr>
+              <w:spacing w:after="0" w:line="276" w:lineRule="auto"/>
+            </w:pPr>
+            <w:r/>
+            <w:r>
+              <w:rPr>
+                <w:b w:val="0"/>
+                <w:sz w:val="18"/>
+              </w:rPr>
+              <w:t>Linear SVM</w:t>
+            </w:r>
+          </w:p>
+        </w:tc>
+        <w:tc>
+          <w:tcPr>
+            <w:tcW w:type="dxa" w:w="1300"/>
+            <w:tcMar>
+              <w:top w:w="80" w:type="dxa"/>
+              <w:start w:w="120" w:type="dxa"/>
+              <w:bottom w:w="80" w:type="dxa"/>
+              <w:end w:w="120" w:type="dxa"/>
+            </w:tcMar>
+            <w:vAlign w:val="center"/>
+          </w:tcPr>
+          <w:p>
+            <w:pPr>
+              <w:spacing w:after="0" w:line="276" w:lineRule="auto"/>
+            </w:pPr>
+            <w:r/>
+            <w:r>
+              <w:rPr>
+                <w:b w:val="0"/>
+                <w:sz w:val="18"/>
+              </w:rPr>
               <w:t>637</w:t>
             </w:r>
           </w:p>
         </w:tc>
         <w:tc>
           <w:tcPr>
-            <w:tcW w:type="dxa" w:w="2300"/>
+            <w:tcW w:type="dxa" w:w="1300"/>
             <w:tcMar>
               <w:top w:w="80" w:type="dxa"/>
               <w:start w:w="120" w:type="dxa"/>
@@ -5489,13 +6322,13 @@
                 <w:b w:val="0"/>
                 <w:sz w:val="18"/>
               </w:rPr>
-              <w:t>100.00%</w:t>
-            </w:r>
-          </w:p>
-        </w:tc>
-        <w:tc>
-          <w:tcPr>
-            <w:tcW w:type="dxa" w:w="1600"/>
+              <w:t>62.43%</w:t>
+            </w:r>
+          </w:p>
+        </w:tc>
+        <w:tc>
+          <w:tcPr>
+            <w:tcW w:type="dxa" w:w="1200"/>
             <w:tcMar>
               <w:top w:w="80" w:type="dxa"/>
               <w:start w:w="120" w:type="dxa"/>
@@ -5514,13 +6347,13 @@
                 <w:b w:val="0"/>
                 <w:sz w:val="18"/>
               </w:rPr>
-              <w:t>73.24%</w:t>
-            </w:r>
-          </w:p>
-        </w:tc>
-        <w:tc>
-          <w:tcPr>
-            <w:tcW w:type="dxa" w:w="1800"/>
+              <w:t>0.6235</w:t>
+            </w:r>
+          </w:p>
+        </w:tc>
+        <w:tc>
+          <w:tcPr>
+            <w:tcW w:type="dxa" w:w="1260"/>
             <w:tcMar>
               <w:top w:w="80" w:type="dxa"/>
               <w:start w:w="120" w:type="dxa"/>
@@ -5539,32 +6372,7 @@
                 <w:b w:val="0"/>
                 <w:sz w:val="18"/>
               </w:rPr>
-              <w:t>0.7319</w:t>
-            </w:r>
-          </w:p>
-        </w:tc>
-        <w:tc>
-          <w:tcPr>
-            <w:tcW w:type="dxa" w:w="1960"/>
-            <w:tcMar>
-              <w:top w:w="80" w:type="dxa"/>
-              <w:start w:w="120" w:type="dxa"/>
-              <w:bottom w:w="80" w:type="dxa"/>
-              <w:end w:w="120" w:type="dxa"/>
-            </w:tcMar>
-            <w:vAlign w:val="center"/>
-          </w:tcPr>
-          <w:p>
-            <w:pPr>
-              <w:spacing w:after="0" w:line="276" w:lineRule="auto"/>
-            </w:pPr>
-            <w:r/>
-            <w:r>
-              <w:rPr>
-                <w:b w:val="0"/>
-                <w:sz w:val="18"/>
-              </w:rPr>
-              <w:t>0.0533 ms</w:t>
+              <w:t>0.00 pp</w:t>
             </w:r>
           </w:p>
         </w:tc>
@@ -5572,7 +6380,7 @@
       <w:tr>
         <w:tc>
           <w:tcPr>
-            <w:tcW w:type="dxa" w:w="1700"/>
+            <w:tcW w:type="dxa" w:w="2300"/>
             <w:tcMar>
               <w:top w:w="80" w:type="dxa"/>
               <w:start w:w="120" w:type="dxa"/>
@@ -5592,13 +6400,13 @@
                 <w:b w:val="0"/>
                 <w:sz w:val="18"/>
               </w:rPr>
-              <w:t>64</w:t>
-            </w:r>
-          </w:p>
-        </w:tc>
-        <w:tc>
-          <w:tcPr>
-            <w:tcW w:type="dxa" w:w="2300"/>
+              <w:t>Controlled ML sweep</w:t>
+            </w:r>
+          </w:p>
+        </w:tc>
+        <w:tc>
+          <w:tcPr>
+            <w:tcW w:type="dxa" w:w="2100"/>
             <w:tcMar>
               <w:top w:w="80" w:type="dxa"/>
               <w:start w:w="120" w:type="dxa"/>
@@ -5618,13 +6426,13 @@
                 <w:b w:val="0"/>
                 <w:sz w:val="18"/>
               </w:rPr>
-              <w:t>99.78%</w:t>
-            </w:r>
-          </w:p>
-        </w:tc>
-        <w:tc>
-          <w:tcPr>
-            <w:tcW w:type="dxa" w:w="1600"/>
+              <w:t>Linear SVM</w:t>
+            </w:r>
+          </w:p>
+        </w:tc>
+        <w:tc>
+          <w:tcPr>
+            <w:tcW w:type="dxa" w:w="1300"/>
             <w:tcMar>
               <w:top w:w="80" w:type="dxa"/>
               <w:start w:w="120" w:type="dxa"/>
@@ -5644,13 +6452,13 @@
                 <w:b w:val="0"/>
                 <w:sz w:val="18"/>
               </w:rPr>
-              <w:t>67.48%</w:t>
-            </w:r>
-          </w:p>
-        </w:tc>
-        <w:tc>
-          <w:tcPr>
-            <w:tcW w:type="dxa" w:w="1800"/>
+              <w:t>128</w:t>
+            </w:r>
+          </w:p>
+        </w:tc>
+        <w:tc>
+          <w:tcPr>
+            <w:tcW w:type="dxa" w:w="1300"/>
             <w:tcMar>
               <w:top w:w="80" w:type="dxa"/>
               <w:start w:w="120" w:type="dxa"/>
@@ -5670,13 +6478,13 @@
                 <w:b w:val="0"/>
                 <w:sz w:val="18"/>
               </w:rPr>
-              <w:t>0.6736</w:t>
-            </w:r>
-          </w:p>
-        </w:tc>
-        <w:tc>
-          <w:tcPr>
-            <w:tcW w:type="dxa" w:w="1960"/>
+              <w:t>59.90%</w:t>
+            </w:r>
+          </w:p>
+        </w:tc>
+        <w:tc>
+          <w:tcPr>
+            <w:tcW w:type="dxa" w:w="1200"/>
             <w:tcMar>
               <w:top w:w="80" w:type="dxa"/>
               <w:start w:w="120" w:type="dxa"/>
@@ -5696,7 +6504,33 @@
                 <w:b w:val="0"/>
                 <w:sz w:val="18"/>
               </w:rPr>
-              <w:t>0.0284 ms</w:t>
+              <w:t>0.5947</w:t>
+            </w:r>
+          </w:p>
+        </w:tc>
+        <w:tc>
+          <w:tcPr>
+            <w:tcW w:type="dxa" w:w="1260"/>
+            <w:tcMar>
+              <w:top w:w="80" w:type="dxa"/>
+              <w:start w:w="120" w:type="dxa"/>
+              <w:bottom w:w="80" w:type="dxa"/>
+              <w:end w:w="120" w:type="dxa"/>
+            </w:tcMar>
+            <w:vAlign w:val="center"/>
+            <w:shd w:fill="FBFCFD"/>
+          </w:tcPr>
+          <w:p>
+            <w:pPr>
+              <w:spacing w:after="0" w:line="276" w:lineRule="auto"/>
+            </w:pPr>
+            <w:r/>
+            <w:r>
+              <w:rPr>
+                <w:b w:val="0"/>
+                <w:sz w:val="18"/>
+              </w:rPr>
+              <w:t>2.52 pp</w:t>
             </w:r>
           </w:p>
         </w:tc>
@@ -5704,7 +6538,7 @@
       <w:tr>
         <w:tc>
           <w:tcPr>
-            <w:tcW w:type="dxa" w:w="1700"/>
+            <w:tcW w:type="dxa" w:w="2300"/>
             <w:tcMar>
               <w:top w:w="80" w:type="dxa"/>
               <w:start w:w="120" w:type="dxa"/>
@@ -5723,13 +6557,13 @@
                 <w:b w:val="0"/>
                 <w:sz w:val="18"/>
               </w:rPr>
-              <w:t>128</w:t>
-            </w:r>
-          </w:p>
-        </w:tc>
-        <w:tc>
-          <w:tcPr>
-            <w:tcW w:type="dxa" w:w="2300"/>
+              <w:t>Controlled ML sweep</w:t>
+            </w:r>
+          </w:p>
+        </w:tc>
+        <w:tc>
+          <w:tcPr>
+            <w:tcW w:type="dxa" w:w="2100"/>
             <w:tcMar>
               <w:top w:w="80" w:type="dxa"/>
               <w:start w:w="120" w:type="dxa"/>
@@ -5748,13 +6582,13 @@
                 <w:b w:val="0"/>
                 <w:sz w:val="18"/>
               </w:rPr>
-              <w:t>99.90%</w:t>
-            </w:r>
-          </w:p>
-        </w:tc>
-        <w:tc>
-          <w:tcPr>
-            <w:tcW w:type="dxa" w:w="1600"/>
+              <w:t>Logistic Regression</w:t>
+            </w:r>
+          </w:p>
+        </w:tc>
+        <w:tc>
+          <w:tcPr>
+            <w:tcW w:type="dxa" w:w="1300"/>
             <w:tcMar>
               <w:top w:w="80" w:type="dxa"/>
               <w:start w:w="120" w:type="dxa"/>
@@ -5773,13 +6607,13 @@
                 <w:b w:val="0"/>
                 <w:sz w:val="18"/>
               </w:rPr>
-              <w:t>68.71%</w:t>
-            </w:r>
-          </w:p>
-        </w:tc>
-        <w:tc>
-          <w:tcPr>
-            <w:tcW w:type="dxa" w:w="1800"/>
+              <w:t>637</w:t>
+            </w:r>
+          </w:p>
+        </w:tc>
+        <w:tc>
+          <w:tcPr>
+            <w:tcW w:type="dxa" w:w="1300"/>
             <w:tcMar>
               <w:top w:w="80" w:type="dxa"/>
               <w:start w:w="120" w:type="dxa"/>
@@ -5798,13 +6632,13 @@
                 <w:b w:val="0"/>
                 <w:sz w:val="18"/>
               </w:rPr>
-              <w:t>0.6863</w:t>
-            </w:r>
-          </w:p>
-        </w:tc>
-        <w:tc>
-          <w:tcPr>
-            <w:tcW w:type="dxa" w:w="1960"/>
+              <w:t>60.24%</w:t>
+            </w:r>
+          </w:p>
+        </w:tc>
+        <w:tc>
+          <w:tcPr>
+            <w:tcW w:type="dxa" w:w="1200"/>
             <w:tcMar>
               <w:top w:w="80" w:type="dxa"/>
               <w:start w:w="120" w:type="dxa"/>
@@ -5823,7 +6657,32 @@
                 <w:b w:val="0"/>
                 <w:sz w:val="18"/>
               </w:rPr>
-              <w:t>0.0314 ms</w:t>
+              <w:t>0.6019</w:t>
+            </w:r>
+          </w:p>
+        </w:tc>
+        <w:tc>
+          <w:tcPr>
+            <w:tcW w:type="dxa" w:w="1260"/>
+            <w:tcMar>
+              <w:top w:w="80" w:type="dxa"/>
+              <w:start w:w="120" w:type="dxa"/>
+              <w:bottom w:w="80" w:type="dxa"/>
+              <w:end w:w="120" w:type="dxa"/>
+            </w:tcMar>
+            <w:vAlign w:val="center"/>
+          </w:tcPr>
+          <w:p>
+            <w:pPr>
+              <w:spacing w:after="0" w:line="276" w:lineRule="auto"/>
+            </w:pPr>
+            <w:r/>
+            <w:r>
+              <w:rPr>
+                <w:b w:val="0"/>
+                <w:sz w:val="18"/>
+              </w:rPr>
+              <w:t>0.00 pp</w:t>
             </w:r>
           </w:p>
         </w:tc>
@@ -5831,7 +6690,7 @@
       <w:tr>
         <w:tc>
           <w:tcPr>
-            <w:tcW w:type="dxa" w:w="1700"/>
+            <w:tcW w:type="dxa" w:w="2300"/>
             <w:tcMar>
               <w:top w:w="80" w:type="dxa"/>
               <w:start w:w="120" w:type="dxa"/>
@@ -5851,10 +6710,142 @@
                 <w:b w:val="0"/>
                 <w:sz w:val="18"/>
               </w:rPr>
-              <w:t>256</w:t>
-            </w:r>
-          </w:p>
-        </w:tc>
+              <w:t>Controlled ML sweep</w:t>
+            </w:r>
+          </w:p>
+        </w:tc>
+        <w:tc>
+          <w:tcPr>
+            <w:tcW w:type="dxa" w:w="2100"/>
+            <w:tcMar>
+              <w:top w:w="80" w:type="dxa"/>
+              <w:start w:w="120" w:type="dxa"/>
+              <w:bottom w:w="80" w:type="dxa"/>
+              <w:end w:w="120" w:type="dxa"/>
+            </w:tcMar>
+            <w:vAlign w:val="center"/>
+            <w:shd w:fill="FBFCFD"/>
+          </w:tcPr>
+          <w:p>
+            <w:pPr>
+              <w:spacing w:after="0" w:line="276" w:lineRule="auto"/>
+            </w:pPr>
+            <w:r/>
+            <w:r>
+              <w:rPr>
+                <w:b w:val="0"/>
+                <w:sz w:val="18"/>
+              </w:rPr>
+              <w:t>Logistic Regression</w:t>
+            </w:r>
+          </w:p>
+        </w:tc>
+        <w:tc>
+          <w:tcPr>
+            <w:tcW w:type="dxa" w:w="1300"/>
+            <w:tcMar>
+              <w:top w:w="80" w:type="dxa"/>
+              <w:start w:w="120" w:type="dxa"/>
+              <w:bottom w:w="80" w:type="dxa"/>
+              <w:end w:w="120" w:type="dxa"/>
+            </w:tcMar>
+            <w:vAlign w:val="center"/>
+            <w:shd w:fill="FBFCFD"/>
+          </w:tcPr>
+          <w:p>
+            <w:pPr>
+              <w:spacing w:after="0" w:line="276" w:lineRule="auto"/>
+            </w:pPr>
+            <w:r/>
+            <w:r>
+              <w:rPr>
+                <w:b w:val="0"/>
+                <w:sz w:val="18"/>
+              </w:rPr>
+              <w:t>128</w:t>
+            </w:r>
+          </w:p>
+        </w:tc>
+        <w:tc>
+          <w:tcPr>
+            <w:tcW w:type="dxa" w:w="1300"/>
+            <w:tcMar>
+              <w:top w:w="80" w:type="dxa"/>
+              <w:start w:w="120" w:type="dxa"/>
+              <w:bottom w:w="80" w:type="dxa"/>
+              <w:end w:w="120" w:type="dxa"/>
+            </w:tcMar>
+            <w:vAlign w:val="center"/>
+            <w:shd w:fill="FBFCFD"/>
+          </w:tcPr>
+          <w:p>
+            <w:pPr>
+              <w:spacing w:after="0" w:line="276" w:lineRule="auto"/>
+            </w:pPr>
+            <w:r/>
+            <w:r>
+              <w:rPr>
+                <w:b w:val="0"/>
+                <w:sz w:val="18"/>
+              </w:rPr>
+              <w:t>59.71%</w:t>
+            </w:r>
+          </w:p>
+        </w:tc>
+        <w:tc>
+          <w:tcPr>
+            <w:tcW w:type="dxa" w:w="1200"/>
+            <w:tcMar>
+              <w:top w:w="80" w:type="dxa"/>
+              <w:start w:w="120" w:type="dxa"/>
+              <w:bottom w:w="80" w:type="dxa"/>
+              <w:end w:w="120" w:type="dxa"/>
+            </w:tcMar>
+            <w:vAlign w:val="center"/>
+            <w:shd w:fill="FBFCFD"/>
+          </w:tcPr>
+          <w:p>
+            <w:pPr>
+              <w:spacing w:after="0" w:line="276" w:lineRule="auto"/>
+            </w:pPr>
+            <w:r/>
+            <w:r>
+              <w:rPr>
+                <w:b w:val="0"/>
+                <w:sz w:val="18"/>
+              </w:rPr>
+              <w:t>0.5954</w:t>
+            </w:r>
+          </w:p>
+        </w:tc>
+        <w:tc>
+          <w:tcPr>
+            <w:tcW w:type="dxa" w:w="1260"/>
+            <w:tcMar>
+              <w:top w:w="80" w:type="dxa"/>
+              <w:start w:w="120" w:type="dxa"/>
+              <w:bottom w:w="80" w:type="dxa"/>
+              <w:end w:w="120" w:type="dxa"/>
+            </w:tcMar>
+            <w:vAlign w:val="center"/>
+            <w:shd w:fill="FBFCFD"/>
+          </w:tcPr>
+          <w:p>
+            <w:pPr>
+              <w:spacing w:after="0" w:line="276" w:lineRule="auto"/>
+            </w:pPr>
+            <w:r/>
+            <w:r>
+              <w:rPr>
+                <w:b w:val="0"/>
+                <w:sz w:val="18"/>
+              </w:rPr>
+              <w:t>0.52 pp</w:t>
+            </w:r>
+          </w:p>
+        </w:tc>
+      </w:tr>
+      <w:tr>
         <w:tc>
           <w:tcPr>
             <w:tcW w:type="dxa" w:w="2300"/>
@@ -5865,6 +6856,158 @@
               <w:end w:w="120" w:type="dxa"/>
             </w:tcMar>
             <w:vAlign w:val="center"/>
+          </w:tcPr>
+          <w:p>
+            <w:pPr>
+              <w:spacing w:after="0" w:line="276" w:lineRule="auto"/>
+            </w:pPr>
+            <w:r/>
+            <w:r>
+              <w:rPr>
+                <w:b w:val="0"/>
+                <w:sz w:val="18"/>
+              </w:rPr>
+              <w:t>ANN-only artifact</w:t>
+            </w:r>
+          </w:p>
+        </w:tc>
+        <w:tc>
+          <w:tcPr>
+            <w:tcW w:type="dxa" w:w="2100"/>
+            <w:tcMar>
+              <w:top w:w="80" w:type="dxa"/>
+              <w:start w:w="120" w:type="dxa"/>
+              <w:bottom w:w="80" w:type="dxa"/>
+              <w:end w:w="120" w:type="dxa"/>
+            </w:tcMar>
+            <w:vAlign w:val="center"/>
+          </w:tcPr>
+          <w:p>
+            <w:pPr>
+              <w:spacing w:after="0" w:line="276" w:lineRule="auto"/>
+            </w:pPr>
+            <w:r/>
+            <w:r>
+              <w:rPr>
+                <w:b w:val="0"/>
+                <w:sz w:val="18"/>
+              </w:rPr>
+              <w:t>MLP</w:t>
+            </w:r>
+          </w:p>
+        </w:tc>
+        <w:tc>
+          <w:tcPr>
+            <w:tcW w:type="dxa" w:w="1300"/>
+            <w:tcMar>
+              <w:top w:w="80" w:type="dxa"/>
+              <w:start w:w="120" w:type="dxa"/>
+              <w:bottom w:w="80" w:type="dxa"/>
+              <w:end w:w="120" w:type="dxa"/>
+            </w:tcMar>
+            <w:vAlign w:val="center"/>
+          </w:tcPr>
+          <w:p>
+            <w:pPr>
+              <w:spacing w:after="0" w:line="276" w:lineRule="auto"/>
+            </w:pPr>
+            <w:r/>
+            <w:r>
+              <w:rPr>
+                <w:b w:val="0"/>
+                <w:sz w:val="18"/>
+              </w:rPr>
+              <w:t>637</w:t>
+            </w:r>
+          </w:p>
+        </w:tc>
+        <w:tc>
+          <w:tcPr>
+            <w:tcW w:type="dxa" w:w="1300"/>
+            <w:tcMar>
+              <w:top w:w="80" w:type="dxa"/>
+              <w:start w:w="120" w:type="dxa"/>
+              <w:bottom w:w="80" w:type="dxa"/>
+              <w:end w:w="120" w:type="dxa"/>
+            </w:tcMar>
+            <w:vAlign w:val="center"/>
+          </w:tcPr>
+          <w:p>
+            <w:pPr>
+              <w:spacing w:after="0" w:line="276" w:lineRule="auto"/>
+            </w:pPr>
+            <w:r/>
+            <w:r>
+              <w:rPr>
+                <w:b w:val="0"/>
+                <w:sz w:val="18"/>
+              </w:rPr>
+              <w:t>73.24%</w:t>
+            </w:r>
+          </w:p>
+        </w:tc>
+        <w:tc>
+          <w:tcPr>
+            <w:tcW w:type="dxa" w:w="1200"/>
+            <w:tcMar>
+              <w:top w:w="80" w:type="dxa"/>
+              <w:start w:w="120" w:type="dxa"/>
+              <w:bottom w:w="80" w:type="dxa"/>
+              <w:end w:w="120" w:type="dxa"/>
+            </w:tcMar>
+            <w:vAlign w:val="center"/>
+          </w:tcPr>
+          <w:p>
+            <w:pPr>
+              <w:spacing w:after="0" w:line="276" w:lineRule="auto"/>
+            </w:pPr>
+            <w:r/>
+            <w:r>
+              <w:rPr>
+                <w:b w:val="0"/>
+                <w:sz w:val="18"/>
+              </w:rPr>
+              <w:t>0.7319</w:t>
+            </w:r>
+          </w:p>
+        </w:tc>
+        <w:tc>
+          <w:tcPr>
+            <w:tcW w:type="dxa" w:w="1260"/>
+            <w:tcMar>
+              <w:top w:w="80" w:type="dxa"/>
+              <w:start w:w="120" w:type="dxa"/>
+              <w:bottom w:w="80" w:type="dxa"/>
+              <w:end w:w="120" w:type="dxa"/>
+            </w:tcMar>
+            <w:vAlign w:val="center"/>
+          </w:tcPr>
+          <w:p>
+            <w:pPr>
+              <w:spacing w:after="0" w:line="276" w:lineRule="auto"/>
+            </w:pPr>
+            <w:r/>
+            <w:r>
+              <w:rPr>
+                <w:b w:val="0"/>
+                <w:sz w:val="18"/>
+              </w:rPr>
+              <w:t>0.00 pp</w:t>
+            </w:r>
+          </w:p>
+        </w:tc>
+      </w:tr>
+      <w:tr>
+        <w:tc>
+          <w:tcPr>
+            <w:tcW w:type="dxa" w:w="2300"/>
+            <w:tcMar>
+              <w:top w:w="80" w:type="dxa"/>
+              <w:start w:w="120" w:type="dxa"/>
+              <w:bottom w:w="80" w:type="dxa"/>
+              <w:end w:w="120" w:type="dxa"/>
+            </w:tcMar>
+            <w:vAlign w:val="center"/>
             <w:shd w:fill="FBFCFD"/>
           </w:tcPr>
           <w:p>
@@ -5877,13 +7020,13 @@
                 <w:b w:val="0"/>
                 <w:sz w:val="18"/>
               </w:rPr>
-              <w:t>99.97%</w:t>
-            </w:r>
-          </w:p>
-        </w:tc>
-        <w:tc>
-          <w:tcPr>
-            <w:tcW w:type="dxa" w:w="1600"/>
+              <w:t>ANN-only artifact</w:t>
+            </w:r>
+          </w:p>
+        </w:tc>
+        <w:tc>
+          <w:tcPr>
+            <w:tcW w:type="dxa" w:w="2100"/>
             <w:tcMar>
               <w:top w:w="80" w:type="dxa"/>
               <w:start w:w="120" w:type="dxa"/>
@@ -5903,13 +7046,13 @@
                 <w:b w:val="0"/>
                 <w:sz w:val="18"/>
               </w:rPr>
-              <w:t>66.95%</w:t>
-            </w:r>
-          </w:p>
-        </w:tc>
-        <w:tc>
-          <w:tcPr>
-            <w:tcW w:type="dxa" w:w="1800"/>
+              <w:t>MLP</w:t>
+            </w:r>
+          </w:p>
+        </w:tc>
+        <w:tc>
+          <w:tcPr>
+            <w:tcW w:type="dxa" w:w="1300"/>
             <w:tcMar>
               <w:top w:w="80" w:type="dxa"/>
               <w:start w:w="120" w:type="dxa"/>
@@ -5929,13 +7072,13 @@
                 <w:b w:val="0"/>
                 <w:sz w:val="18"/>
               </w:rPr>
-              <w:t>0.6691</w:t>
-            </w:r>
-          </w:p>
-        </w:tc>
-        <w:tc>
-          <w:tcPr>
-            <w:tcW w:type="dxa" w:w="1960"/>
+              <w:t>128</w:t>
+            </w:r>
+          </w:p>
+        </w:tc>
+        <w:tc>
+          <w:tcPr>
+            <w:tcW w:type="dxa" w:w="1300"/>
             <w:tcMar>
               <w:top w:w="80" w:type="dxa"/>
               <w:start w:w="120" w:type="dxa"/>
@@ -5955,7 +7098,59 @@
                 <w:b w:val="0"/>
                 <w:sz w:val="18"/>
               </w:rPr>
-              <w:t>0.0296 ms</w:t>
+              <w:t>68.71%</w:t>
+            </w:r>
+          </w:p>
+        </w:tc>
+        <w:tc>
+          <w:tcPr>
+            <w:tcW w:type="dxa" w:w="1200"/>
+            <w:tcMar>
+              <w:top w:w="80" w:type="dxa"/>
+              <w:start w:w="120" w:type="dxa"/>
+              <w:bottom w:w="80" w:type="dxa"/>
+              <w:end w:w="120" w:type="dxa"/>
+            </w:tcMar>
+            <w:vAlign w:val="center"/>
+            <w:shd w:fill="FBFCFD"/>
+          </w:tcPr>
+          <w:p>
+            <w:pPr>
+              <w:spacing w:after="0" w:line="276" w:lineRule="auto"/>
+            </w:pPr>
+            <w:r/>
+            <w:r>
+              <w:rPr>
+                <w:b w:val="0"/>
+                <w:sz w:val="18"/>
+              </w:rPr>
+              <w:t>0.6863</w:t>
+            </w:r>
+          </w:p>
+        </w:tc>
+        <w:tc>
+          <w:tcPr>
+            <w:tcW w:type="dxa" w:w="1260"/>
+            <w:tcMar>
+              <w:top w:w="80" w:type="dxa"/>
+              <w:start w:w="120" w:type="dxa"/>
+              <w:bottom w:w="80" w:type="dxa"/>
+              <w:end w:w="120" w:type="dxa"/>
+            </w:tcMar>
+            <w:vAlign w:val="center"/>
+            <w:shd w:fill="FBFCFD"/>
+          </w:tcPr>
+          <w:p>
+            <w:pPr>
+              <w:spacing w:after="0" w:line="276" w:lineRule="auto"/>
+            </w:pPr>
+            <w:r/>
+            <w:r>
+              <w:rPr>
+                <w:b w:val="0"/>
+                <w:sz w:val="18"/>
+              </w:rPr>
+              <w:t>4.53 pp</w:t>
             </w:r>
           </w:p>
         </w:tc>
@@ -5980,7 +7175,7 @@
         <w:tc>
           <w:tcPr>
             <w:tcW w:type="dxa" w:w="9360"/>
-            <w:shd w:fill="FFF7DF"/>
+            <w:shd w:fill="EAF4EE"/>
             <w:tcMar>
               <w:top w:w="80" w:type="dxa"/>
               <w:start w:w="120" w:type="dxa"/>
@@ -6012,7 +7207,7 @@
                 <w:color w:val="0B2545"/>
                 <w:sz w:val="20"/>
               </w:rPr>
-              <w:t>Current artifact shows 637 -&gt; 128 drops accuracy from 73.24% to 68.71%, a 4.53 percentage-point drop. If slides need to say around 2%, rerun PCA or replace with the matching artifact.</w:t>
+              <w:t>Use the controlled ML sweep for the 'about 2%' statement: Linear SVM drops 2.52 percentage points when reducing 637 features to 128 PCA components. The older ANN-only PCA artifact drops 4.53 points, so it must be labelled separately.</w:t>
             </w:r>
           </w:p>
         </w:tc>
@@ -6026,7 +7221,7 @@
       <w:r>
         <w:drawing>
           <wp:inline xmlns:a="http://schemas.openxmlformats.org/drawingml/2006/main" xmlns:pic="http://schemas.openxmlformats.org/drawingml/2006/picture">
-            <wp:extent cx="5303520" cy="2651760"/>
+            <wp:extent cx="5303520" cy="2916936"/>
             <wp:docPr id="3" name="Picture 3"/>
             <wp:cNvGraphicFramePr>
               <a:graphicFrameLocks noChangeAspect="1"/>
@@ -6035,7 +7230,7 @@
               <a:graphicData uri="http://schemas.openxmlformats.org/drawingml/2006/picture">
                 <pic:pic>
                   <pic:nvPicPr>
-                    <pic:cNvPr id="0" name="pca_dimensionality_chart.png"/>
+                    <pic:cNvPr id="0" name="pca_model_sweep_accuracy.png"/>
                     <pic:cNvPicPr/>
                   </pic:nvPicPr>
                   <pic:blipFill>
@@ -6047,7 +7242,7 @@
                   <pic:spPr>
                     <a:xfrm>
                       <a:off x="0" y="0"/>
-                      <a:ext cx="5303520" cy="2651760"/>
+                      <a:ext cx="5303520" cy="2916936"/>
                     </a:xfrm>
                     <a:prstGeom prst="rect"/>
                   </pic:spPr>
@@ -6069,7 +7264,7 @@
           <w:color w:val="555555"/>
           <w:sz w:val="18"/>
         </w:rPr>
-        <w:t>Figure 3. PCA component count vs accuracy and latency.</w:t>
+        <w:t>Figure 3. PCA components vs accuracy by classical model.</w:t>
       </w:r>
     </w:p>
     <w:p>
@@ -7395,12 +8590,12 @@
       </w:tblPr>
       <w:tblGrid>
         <w:gridCol w:w="3000"/>
+        <w:gridCol w:w="850"/>
+        <w:gridCol w:w="1000"/>
+        <w:gridCol w:w="1000"/>
+        <w:gridCol w:w="850"/>
         <w:gridCol w:w="1200"/>
-        <w:gridCol w:w="1200"/>
-        <w:gridCol w:w="1400"/>
-        <w:gridCol w:w="800"/>
-        <w:gridCol w:w="800"/>
-        <w:gridCol w:w="960"/>
+        <w:gridCol w:w="1460"/>
       </w:tblGrid>
       <w:tr>
         <w:trPr>
@@ -7440,7 +8635,7 @@
         </w:tc>
         <w:tc>
           <w:tcPr>
-            <w:tcW w:type="dxa" w:w="1200"/>
+            <w:tcW w:type="dxa" w:w="850"/>
             <w:tcMar>
               <w:top w:w="80" w:type="dxa"/>
               <w:start w:w="120" w:type="dxa"/>
@@ -7466,13 +8661,13 @@
                 <w:color w:val="0B2545"/>
                 <w:sz w:val="18"/>
               </w:rPr>
-              <w:t>Precision</w:t>
-            </w:r>
-          </w:p>
-        </w:tc>
-        <w:tc>
-          <w:tcPr>
-            <w:tcW w:type="dxa" w:w="1200"/>
+              <w:t>Images</w:t>
+            </w:r>
+          </w:p>
+        </w:tc>
+        <w:tc>
+          <w:tcPr>
+            <w:tcW w:type="dxa" w:w="1000"/>
             <w:tcMar>
               <w:top w:w="80" w:type="dxa"/>
               <w:start w:w="120" w:type="dxa"/>
@@ -7498,13 +8693,13 @@
                 <w:color w:val="0B2545"/>
                 <w:sz w:val="18"/>
               </w:rPr>
-              <w:t>Recall</w:t>
-            </w:r>
-          </w:p>
-        </w:tc>
-        <w:tc>
-          <w:tcPr>
-            <w:tcW w:type="dxa" w:w="1400"/>
+              <w:t>Precision</w:t>
+            </w:r>
+          </w:p>
+        </w:tc>
+        <w:tc>
+          <w:tcPr>
+            <w:tcW w:type="dxa" w:w="1000"/>
             <w:tcMar>
               <w:top w:w="80" w:type="dxa"/>
               <w:start w:w="120" w:type="dxa"/>
@@ -7530,13 +8725,13 @@
                 <w:color w:val="0B2545"/>
                 <w:sz w:val="18"/>
               </w:rPr>
-              <w:t>Mean IoU</w:t>
-            </w:r>
-          </w:p>
-        </w:tc>
-        <w:tc>
-          <w:tcPr>
-            <w:tcW w:type="dxa" w:w="800"/>
+              <w:t>Recall</w:t>
+            </w:r>
+          </w:p>
+        </w:tc>
+        <w:tc>
+          <w:tcPr>
+            <w:tcW w:type="dxa" w:w="850"/>
             <w:tcMar>
               <w:top w:w="80" w:type="dxa"/>
               <w:start w:w="120" w:type="dxa"/>
@@ -7562,13 +8757,13 @@
                 <w:color w:val="0B2545"/>
                 <w:sz w:val="18"/>
               </w:rPr>
-              <w:t>TP</w:t>
-            </w:r>
-          </w:p>
-        </w:tc>
-        <w:tc>
-          <w:tcPr>
-            <w:tcW w:type="dxa" w:w="800"/>
+              <w:t>F1</w:t>
+            </w:r>
+          </w:p>
+        </w:tc>
+        <w:tc>
+          <w:tcPr>
+            <w:tcW w:type="dxa" w:w="1200"/>
             <w:tcMar>
               <w:top w:w="80" w:type="dxa"/>
               <w:start w:w="120" w:type="dxa"/>
@@ -7594,13 +8789,13 @@
                 <w:color w:val="0B2545"/>
                 <w:sz w:val="18"/>
               </w:rPr>
-              <w:t>FP</w:t>
-            </w:r>
-          </w:p>
-        </w:tc>
-        <w:tc>
-          <w:tcPr>
-            <w:tcW w:type="dxa" w:w="960"/>
+              <w:t>Mean IoU</w:t>
+            </w:r>
+          </w:p>
+        </w:tc>
+        <w:tc>
+          <w:tcPr>
+            <w:tcW w:type="dxa" w:w="1460"/>
             <w:tcMar>
               <w:top w:w="80" w:type="dxa"/>
               <w:start w:w="120" w:type="dxa"/>
@@ -7626,7 +8821,7 @@
                 <w:color w:val="0B2545"/>
                 <w:sz w:val="18"/>
               </w:rPr>
-              <w:t>FN</w:t>
+              <w:t>TP/FP/FN</w:t>
             </w:r>
           </w:p>
         </w:tc>
@@ -7659,6 +8854,106 @@
         </w:tc>
         <w:tc>
           <w:tcPr>
+            <w:tcW w:type="dxa" w:w="850"/>
+            <w:tcMar>
+              <w:top w:w="80" w:type="dxa"/>
+              <w:start w:w="120" w:type="dxa"/>
+              <w:bottom w:w="80" w:type="dxa"/>
+              <w:end w:w="120" w:type="dxa"/>
+            </w:tcMar>
+            <w:vAlign w:val="center"/>
+          </w:tcPr>
+          <w:p>
+            <w:pPr>
+              <w:spacing w:after="0" w:line="276" w:lineRule="auto"/>
+            </w:pPr>
+            <w:r/>
+            <w:r>
+              <w:rPr>
+                <w:b w:val="0"/>
+                <w:sz w:val="18"/>
+              </w:rPr>
+              <w:t>60</w:t>
+            </w:r>
+          </w:p>
+        </w:tc>
+        <w:tc>
+          <w:tcPr>
+            <w:tcW w:type="dxa" w:w="1000"/>
+            <w:tcMar>
+              <w:top w:w="80" w:type="dxa"/>
+              <w:start w:w="120" w:type="dxa"/>
+              <w:bottom w:w="80" w:type="dxa"/>
+              <w:end w:w="120" w:type="dxa"/>
+            </w:tcMar>
+            <w:vAlign w:val="center"/>
+          </w:tcPr>
+          <w:p>
+            <w:pPr>
+              <w:spacing w:after="0" w:line="276" w:lineRule="auto"/>
+            </w:pPr>
+            <w:r/>
+            <w:r>
+              <w:rPr>
+                <w:b w:val="0"/>
+                <w:sz w:val="18"/>
+              </w:rPr>
+              <w:t>0.2568</w:t>
+            </w:r>
+          </w:p>
+        </w:tc>
+        <w:tc>
+          <w:tcPr>
+            <w:tcW w:type="dxa" w:w="1000"/>
+            <w:tcMar>
+              <w:top w:w="80" w:type="dxa"/>
+              <w:start w:w="120" w:type="dxa"/>
+              <w:bottom w:w="80" w:type="dxa"/>
+              <w:end w:w="120" w:type="dxa"/>
+            </w:tcMar>
+            <w:vAlign w:val="center"/>
+          </w:tcPr>
+          <w:p>
+            <w:pPr>
+              <w:spacing w:after="0" w:line="276" w:lineRule="auto"/>
+            </w:pPr>
+            <w:r/>
+            <w:r>
+              <w:rPr>
+                <w:b w:val="0"/>
+                <w:sz w:val="18"/>
+              </w:rPr>
+              <w:t>0.0728</w:t>
+            </w:r>
+          </w:p>
+        </w:tc>
+        <w:tc>
+          <w:tcPr>
+            <w:tcW w:type="dxa" w:w="850"/>
+            <w:tcMar>
+              <w:top w:w="80" w:type="dxa"/>
+              <w:start w:w="120" w:type="dxa"/>
+              <w:bottom w:w="80" w:type="dxa"/>
+              <w:end w:w="120" w:type="dxa"/>
+            </w:tcMar>
+            <w:vAlign w:val="center"/>
+          </w:tcPr>
+          <w:p>
+            <w:pPr>
+              <w:spacing w:after="0" w:line="276" w:lineRule="auto"/>
+            </w:pPr>
+            <w:r/>
+            <w:r>
+              <w:rPr>
+                <w:b w:val="0"/>
+                <w:sz w:val="18"/>
+              </w:rPr>
+              <w:t>0.1134</w:t>
+            </w:r>
+          </w:p>
+        </w:tc>
+        <w:tc>
+          <w:tcPr>
             <w:tcW w:type="dxa" w:w="1200"/>
             <w:tcMar>
               <w:top w:w="80" w:type="dxa"/>
@@ -7678,13 +8973,13 @@
                 <w:b w:val="0"/>
                 <w:sz w:val="18"/>
               </w:rPr>
-              <w:t>0.2568</w:t>
-            </w:r>
-          </w:p>
-        </w:tc>
-        <w:tc>
-          <w:tcPr>
-            <w:tcW w:type="dxa" w:w="1200"/>
+              <w:t>0.7127</w:t>
+            </w:r>
+          </w:p>
+        </w:tc>
+        <w:tc>
+          <w:tcPr>
+            <w:tcW w:type="dxa" w:w="1460"/>
             <w:tcMar>
               <w:top w:w="80" w:type="dxa"/>
               <w:start w:w="120" w:type="dxa"/>
@@ -7703,107 +8998,7 @@
                 <w:b w:val="0"/>
                 <w:sz w:val="18"/>
               </w:rPr>
-              <w:t>0.0728</w:t>
-            </w:r>
-          </w:p>
-        </w:tc>
-        <w:tc>
-          <w:tcPr>
-            <w:tcW w:type="dxa" w:w="1400"/>
-            <w:tcMar>
-              <w:top w:w="80" w:type="dxa"/>
-              <w:start w:w="120" w:type="dxa"/>
-              <w:bottom w:w="80" w:type="dxa"/>
-              <w:end w:w="120" w:type="dxa"/>
-            </w:tcMar>
-            <w:vAlign w:val="center"/>
-          </w:tcPr>
-          <w:p>
-            <w:pPr>
-              <w:spacing w:after="0" w:line="276" w:lineRule="auto"/>
-            </w:pPr>
-            <w:r/>
-            <w:r>
-              <w:rPr>
-                <w:b w:val="0"/>
-                <w:sz w:val="18"/>
-              </w:rPr>
-              <w:t>0.7127</w:t>
-            </w:r>
-          </w:p>
-        </w:tc>
-        <w:tc>
-          <w:tcPr>
-            <w:tcW w:type="dxa" w:w="800"/>
-            <w:tcMar>
-              <w:top w:w="80" w:type="dxa"/>
-              <w:start w:w="120" w:type="dxa"/>
-              <w:bottom w:w="80" w:type="dxa"/>
-              <w:end w:w="120" w:type="dxa"/>
-            </w:tcMar>
-            <w:vAlign w:val="center"/>
-          </w:tcPr>
-          <w:p>
-            <w:pPr>
-              <w:spacing w:after="0" w:line="276" w:lineRule="auto"/>
-            </w:pPr>
-            <w:r/>
-            <w:r>
-              <w:rPr>
-                <w:b w:val="0"/>
-                <w:sz w:val="18"/>
-              </w:rPr>
-              <w:t>19</w:t>
-            </w:r>
-          </w:p>
-        </w:tc>
-        <w:tc>
-          <w:tcPr>
-            <w:tcW w:type="dxa" w:w="800"/>
-            <w:tcMar>
-              <w:top w:w="80" w:type="dxa"/>
-              <w:start w:w="120" w:type="dxa"/>
-              <w:bottom w:w="80" w:type="dxa"/>
-              <w:end w:w="120" w:type="dxa"/>
-            </w:tcMar>
-            <w:vAlign w:val="center"/>
-          </w:tcPr>
-          <w:p>
-            <w:pPr>
-              <w:spacing w:after="0" w:line="276" w:lineRule="auto"/>
-            </w:pPr>
-            <w:r/>
-            <w:r>
-              <w:rPr>
-                <w:b w:val="0"/>
-                <w:sz w:val="18"/>
-              </w:rPr>
-              <w:t>55</w:t>
-            </w:r>
-          </w:p>
-        </w:tc>
-        <w:tc>
-          <w:tcPr>
-            <w:tcW w:type="dxa" w:w="960"/>
-            <w:tcMar>
-              <w:top w:w="80" w:type="dxa"/>
-              <w:start w:w="120" w:type="dxa"/>
-              <w:bottom w:w="80" w:type="dxa"/>
-              <w:end w:w="120" w:type="dxa"/>
-            </w:tcMar>
-            <w:vAlign w:val="center"/>
-          </w:tcPr>
-          <w:p>
-            <w:pPr>
-              <w:spacing w:after="0" w:line="276" w:lineRule="auto"/>
-            </w:pPr>
-            <w:r/>
-            <w:r>
-              <w:rPr>
-                <w:b w:val="0"/>
-                <w:sz w:val="18"/>
-              </w:rPr>
-              <w:t>242</w:t>
+              <w:t>19 / 55 / 242</w:t>
             </w:r>
           </w:p>
         </w:tc>
@@ -7831,7 +9026,111 @@
                 <w:b w:val="0"/>
                 <w:sz w:val="18"/>
               </w:rPr>
-              <w:t>YOLO localization-only, conf=0.25</w:t>
+              <w:t>YOLO conf=0.25 ablation</w:t>
+            </w:r>
+          </w:p>
+        </w:tc>
+        <w:tc>
+          <w:tcPr>
+            <w:tcW w:type="dxa" w:w="850"/>
+            <w:tcMar>
+              <w:top w:w="80" w:type="dxa"/>
+              <w:start w:w="120" w:type="dxa"/>
+              <w:bottom w:w="80" w:type="dxa"/>
+              <w:end w:w="120" w:type="dxa"/>
+            </w:tcMar>
+            <w:vAlign w:val="center"/>
+            <w:shd w:fill="FBFCFD"/>
+          </w:tcPr>
+          <w:p>
+            <w:pPr>
+              <w:spacing w:after="0" w:line="276" w:lineRule="auto"/>
+            </w:pPr>
+            <w:r/>
+            <w:r>
+              <w:rPr>
+                <w:b w:val="0"/>
+                <w:sz w:val="18"/>
+              </w:rPr>
+              <w:t>60</w:t>
+            </w:r>
+          </w:p>
+        </w:tc>
+        <w:tc>
+          <w:tcPr>
+            <w:tcW w:type="dxa" w:w="1000"/>
+            <w:tcMar>
+              <w:top w:w="80" w:type="dxa"/>
+              <w:start w:w="120" w:type="dxa"/>
+              <w:bottom w:w="80" w:type="dxa"/>
+              <w:end w:w="120" w:type="dxa"/>
+            </w:tcMar>
+            <w:vAlign w:val="center"/>
+            <w:shd w:fill="FBFCFD"/>
+          </w:tcPr>
+          <w:p>
+            <w:pPr>
+              <w:spacing w:after="0" w:line="276" w:lineRule="auto"/>
+            </w:pPr>
+            <w:r/>
+            <w:r>
+              <w:rPr>
+                <w:b w:val="0"/>
+                <w:sz w:val="18"/>
+              </w:rPr>
+              <w:t>0.6352</w:t>
+            </w:r>
+          </w:p>
+        </w:tc>
+        <w:tc>
+          <w:tcPr>
+            <w:tcW w:type="dxa" w:w="1000"/>
+            <w:tcMar>
+              <w:top w:w="80" w:type="dxa"/>
+              <w:start w:w="120" w:type="dxa"/>
+              <w:bottom w:w="80" w:type="dxa"/>
+              <w:end w:w="120" w:type="dxa"/>
+            </w:tcMar>
+            <w:vAlign w:val="center"/>
+            <w:shd w:fill="FBFCFD"/>
+          </w:tcPr>
+          <w:p>
+            <w:pPr>
+              <w:spacing w:after="0" w:line="276" w:lineRule="auto"/>
+            </w:pPr>
+            <w:r/>
+            <w:r>
+              <w:rPr>
+                <w:b w:val="0"/>
+                <w:sz w:val="18"/>
+              </w:rPr>
+              <w:t>0.5670</w:t>
+            </w:r>
+          </w:p>
+        </w:tc>
+        <w:tc>
+          <w:tcPr>
+            <w:tcW w:type="dxa" w:w="850"/>
+            <w:tcMar>
+              <w:top w:w="80" w:type="dxa"/>
+              <w:start w:w="120" w:type="dxa"/>
+              <w:bottom w:w="80" w:type="dxa"/>
+              <w:end w:w="120" w:type="dxa"/>
+            </w:tcMar>
+            <w:vAlign w:val="center"/>
+            <w:shd w:fill="FBFCFD"/>
+          </w:tcPr>
+          <w:p>
+            <w:pPr>
+              <w:spacing w:after="0" w:line="276" w:lineRule="auto"/>
+            </w:pPr>
+            <w:r/>
+            <w:r>
+              <w:rPr>
+                <w:b w:val="0"/>
+                <w:sz w:val="18"/>
+              </w:rPr>
+              <w:t>0.5991</w:t>
             </w:r>
           </w:p>
         </w:tc>
@@ -7857,13 +9156,13 @@
                 <w:b w:val="0"/>
                 <w:sz w:val="18"/>
               </w:rPr>
-              <w:t>0.6352</w:t>
-            </w:r>
-          </w:p>
-        </w:tc>
-        <w:tc>
-          <w:tcPr>
-            <w:tcW w:type="dxa" w:w="1200"/>
+              <w:t>0.9012</w:t>
+            </w:r>
+          </w:p>
+        </w:tc>
+        <w:tc>
+          <w:tcPr>
+            <w:tcW w:type="dxa" w:w="1460"/>
             <w:tcMar>
               <w:top w:w="80" w:type="dxa"/>
               <w:start w:w="120" w:type="dxa"/>
@@ -7883,111 +9182,7 @@
                 <w:b w:val="0"/>
                 <w:sz w:val="18"/>
               </w:rPr>
-              <w:t>0.5670</w:t>
-            </w:r>
-          </w:p>
-        </w:tc>
-        <w:tc>
-          <w:tcPr>
-            <w:tcW w:type="dxa" w:w="1400"/>
-            <w:tcMar>
-              <w:top w:w="80" w:type="dxa"/>
-              <w:start w:w="120" w:type="dxa"/>
-              <w:bottom w:w="80" w:type="dxa"/>
-              <w:end w:w="120" w:type="dxa"/>
-            </w:tcMar>
-            <w:vAlign w:val="center"/>
-            <w:shd w:fill="FBFCFD"/>
-          </w:tcPr>
-          <w:p>
-            <w:pPr>
-              <w:spacing w:after="0" w:line="276" w:lineRule="auto"/>
-            </w:pPr>
-            <w:r/>
-            <w:r>
-              <w:rPr>
-                <w:b w:val="0"/>
-                <w:sz w:val="18"/>
-              </w:rPr>
-              <w:t>0.9012</w:t>
-            </w:r>
-          </w:p>
-        </w:tc>
-        <w:tc>
-          <w:tcPr>
-            <w:tcW w:type="dxa" w:w="800"/>
-            <w:tcMar>
-              <w:top w:w="80" w:type="dxa"/>
-              <w:start w:w="120" w:type="dxa"/>
-              <w:bottom w:w="80" w:type="dxa"/>
-              <w:end w:w="120" w:type="dxa"/>
-            </w:tcMar>
-            <w:vAlign w:val="center"/>
-            <w:shd w:fill="FBFCFD"/>
-          </w:tcPr>
-          <w:p>
-            <w:pPr>
-              <w:spacing w:after="0" w:line="276" w:lineRule="auto"/>
-            </w:pPr>
-            <w:r/>
-            <w:r>
-              <w:rPr>
-                <w:b w:val="0"/>
-                <w:sz w:val="18"/>
-              </w:rPr>
-              <w:t>148</w:t>
-            </w:r>
-          </w:p>
-        </w:tc>
-        <w:tc>
-          <w:tcPr>
-            <w:tcW w:type="dxa" w:w="800"/>
-            <w:tcMar>
-              <w:top w:w="80" w:type="dxa"/>
-              <w:start w:w="120" w:type="dxa"/>
-              <w:bottom w:w="80" w:type="dxa"/>
-              <w:end w:w="120" w:type="dxa"/>
-            </w:tcMar>
-            <w:vAlign w:val="center"/>
-            <w:shd w:fill="FBFCFD"/>
-          </w:tcPr>
-          <w:p>
-            <w:pPr>
-              <w:spacing w:after="0" w:line="276" w:lineRule="auto"/>
-            </w:pPr>
-            <w:r/>
-            <w:r>
-              <w:rPr>
-                <w:b w:val="0"/>
-                <w:sz w:val="18"/>
-              </w:rPr>
-              <w:t>85</w:t>
-            </w:r>
-          </w:p>
-        </w:tc>
-        <w:tc>
-          <w:tcPr>
-            <w:tcW w:type="dxa" w:w="960"/>
-            <w:tcMar>
-              <w:top w:w="80" w:type="dxa"/>
-              <w:start w:w="120" w:type="dxa"/>
-              <w:bottom w:w="80" w:type="dxa"/>
-              <w:end w:w="120" w:type="dxa"/>
-            </w:tcMar>
-            <w:vAlign w:val="center"/>
-            <w:shd w:fill="FBFCFD"/>
-          </w:tcPr>
-          <w:p>
-            <w:pPr>
-              <w:spacing w:after="0" w:line="276" w:lineRule="auto"/>
-            </w:pPr>
-            <w:r/>
-            <w:r>
-              <w:rPr>
-                <w:b w:val="0"/>
-                <w:sz w:val="18"/>
-              </w:rPr>
-              <w:t>113</w:t>
+              <w:t>148 / 85 / 113</w:t>
             </w:r>
           </w:p>
         </w:tc>
@@ -8014,7 +9209,107 @@
                 <w:b w:val="0"/>
                 <w:sz w:val="18"/>
               </w:rPr>
-              <w:t>YOLO localization-only, conf=0.35</w:t>
+              <w:t>YOLO conf=0.30 promoted final</w:t>
+            </w:r>
+          </w:p>
+        </w:tc>
+        <w:tc>
+          <w:tcPr>
+            <w:tcW w:type="dxa" w:w="850"/>
+            <w:tcMar>
+              <w:top w:w="80" w:type="dxa"/>
+              <w:start w:w="120" w:type="dxa"/>
+              <w:bottom w:w="80" w:type="dxa"/>
+              <w:end w:w="120" w:type="dxa"/>
+            </w:tcMar>
+            <w:vAlign w:val="center"/>
+          </w:tcPr>
+          <w:p>
+            <w:pPr>
+              <w:spacing w:after="0" w:line="276" w:lineRule="auto"/>
+            </w:pPr>
+            <w:r/>
+            <w:r>
+              <w:rPr>
+                <w:b w:val="0"/>
+                <w:sz w:val="18"/>
+              </w:rPr>
+              <w:t>300</w:t>
+            </w:r>
+          </w:p>
+        </w:tc>
+        <w:tc>
+          <w:tcPr>
+            <w:tcW w:type="dxa" w:w="1000"/>
+            <w:tcMar>
+              <w:top w:w="80" w:type="dxa"/>
+              <w:start w:w="120" w:type="dxa"/>
+              <w:bottom w:w="80" w:type="dxa"/>
+              <w:end w:w="120" w:type="dxa"/>
+            </w:tcMar>
+            <w:vAlign w:val="center"/>
+          </w:tcPr>
+          <w:p>
+            <w:pPr>
+              <w:spacing w:after="0" w:line="276" w:lineRule="auto"/>
+            </w:pPr>
+            <w:r/>
+            <w:r>
+              <w:rPr>
+                <w:b w:val="0"/>
+                <w:sz w:val="18"/>
+              </w:rPr>
+              <w:t>0.6999</w:t>
+            </w:r>
+          </w:p>
+        </w:tc>
+        <w:tc>
+          <w:tcPr>
+            <w:tcW w:type="dxa" w:w="1000"/>
+            <w:tcMar>
+              <w:top w:w="80" w:type="dxa"/>
+              <w:start w:w="120" w:type="dxa"/>
+              <w:bottom w:w="80" w:type="dxa"/>
+              <w:end w:w="120" w:type="dxa"/>
+            </w:tcMar>
+            <w:vAlign w:val="center"/>
+          </w:tcPr>
+          <w:p>
+            <w:pPr>
+              <w:spacing w:after="0" w:line="276" w:lineRule="auto"/>
+            </w:pPr>
+            <w:r/>
+            <w:r>
+              <w:rPr>
+                <w:b w:val="0"/>
+                <w:sz w:val="18"/>
+              </w:rPr>
+              <w:t>0.5729</w:t>
+            </w:r>
+          </w:p>
+        </w:tc>
+        <w:tc>
+          <w:tcPr>
+            <w:tcW w:type="dxa" w:w="850"/>
+            <w:tcMar>
+              <w:top w:w="80" w:type="dxa"/>
+              <w:start w:w="120" w:type="dxa"/>
+              <w:bottom w:w="80" w:type="dxa"/>
+              <w:end w:w="120" w:type="dxa"/>
+            </w:tcMar>
+            <w:vAlign w:val="center"/>
+          </w:tcPr>
+          <w:p>
+            <w:pPr>
+              <w:spacing w:after="0" w:line="276" w:lineRule="auto"/>
+            </w:pPr>
+            <w:r/>
+            <w:r>
+              <w:rPr>
+                <w:b w:val="0"/>
+                <w:sz w:val="18"/>
+              </w:rPr>
+              <w:t>0.6301</w:t>
             </w:r>
           </w:p>
         </w:tc>
@@ -8039,7 +9334,164 @@
                 <w:b w:val="0"/>
                 <w:sz w:val="18"/>
               </w:rPr>
-              <w:t>0.7614</w:t>
+              <w:t>0.9057</w:t>
+            </w:r>
+          </w:p>
+        </w:tc>
+        <w:tc>
+          <w:tcPr>
+            <w:tcW w:type="dxa" w:w="1460"/>
+            <w:tcMar>
+              <w:top w:w="80" w:type="dxa"/>
+              <w:start w:w="120" w:type="dxa"/>
+              <w:bottom w:w="80" w:type="dxa"/>
+              <w:end w:w="120" w:type="dxa"/>
+            </w:tcMar>
+            <w:vAlign w:val="center"/>
+          </w:tcPr>
+          <w:p>
+            <w:pPr>
+              <w:spacing w:after="0" w:line="276" w:lineRule="auto"/>
+            </w:pPr>
+            <w:r/>
+            <w:r>
+              <w:rPr>
+                <w:b w:val="0"/>
+                <w:sz w:val="18"/>
+              </w:rPr>
+              <w:t>660 / 283 / 492</w:t>
+            </w:r>
+          </w:p>
+        </w:tc>
+      </w:tr>
+      <w:tr>
+        <w:tc>
+          <w:tcPr>
+            <w:tcW w:type="dxa" w:w="3000"/>
+            <w:tcMar>
+              <w:top w:w="80" w:type="dxa"/>
+              <w:start w:w="120" w:type="dxa"/>
+              <w:bottom w:w="80" w:type="dxa"/>
+              <w:end w:w="120" w:type="dxa"/>
+            </w:tcMar>
+            <w:vAlign w:val="center"/>
+            <w:shd w:fill="FBFCFD"/>
+          </w:tcPr>
+          <w:p>
+            <w:pPr>
+              <w:spacing w:after="0" w:line="276" w:lineRule="auto"/>
+            </w:pPr>
+            <w:r/>
+            <w:r>
+              <w:rPr>
+                <w:b w:val="0"/>
+                <w:sz w:val="18"/>
+              </w:rPr>
+              <w:t>YOLO conf=0.35 balanced sweep</w:t>
+            </w:r>
+          </w:p>
+        </w:tc>
+        <w:tc>
+          <w:tcPr>
+            <w:tcW w:type="dxa" w:w="850"/>
+            <w:tcMar>
+              <w:top w:w="80" w:type="dxa"/>
+              <w:start w:w="120" w:type="dxa"/>
+              <w:bottom w:w="80" w:type="dxa"/>
+              <w:end w:w="120" w:type="dxa"/>
+            </w:tcMar>
+            <w:vAlign w:val="center"/>
+            <w:shd w:fill="FBFCFD"/>
+          </w:tcPr>
+          <w:p>
+            <w:pPr>
+              <w:spacing w:after="0" w:line="276" w:lineRule="auto"/>
+            </w:pPr>
+            <w:r/>
+            <w:r>
+              <w:rPr>
+                <w:b w:val="0"/>
+                <w:sz w:val="18"/>
+              </w:rPr>
+              <w:t>300</w:t>
+            </w:r>
+          </w:p>
+        </w:tc>
+        <w:tc>
+          <w:tcPr>
+            <w:tcW w:type="dxa" w:w="1000"/>
+            <w:tcMar>
+              <w:top w:w="80" w:type="dxa"/>
+              <w:start w:w="120" w:type="dxa"/>
+              <w:bottom w:w="80" w:type="dxa"/>
+              <w:end w:w="120" w:type="dxa"/>
+            </w:tcMar>
+            <w:vAlign w:val="center"/>
+            <w:shd w:fill="FBFCFD"/>
+          </w:tcPr>
+          <w:p>
+            <w:pPr>
+              <w:spacing w:after="0" w:line="276" w:lineRule="auto"/>
+            </w:pPr>
+            <w:r/>
+            <w:r>
+              <w:rPr>
+                <w:b w:val="0"/>
+                <w:sz w:val="18"/>
+              </w:rPr>
+              <w:t>0.7571</w:t>
+            </w:r>
+          </w:p>
+        </w:tc>
+        <w:tc>
+          <w:tcPr>
+            <w:tcW w:type="dxa" w:w="1000"/>
+            <w:tcMar>
+              <w:top w:w="80" w:type="dxa"/>
+              <w:start w:w="120" w:type="dxa"/>
+              <w:bottom w:w="80" w:type="dxa"/>
+              <w:end w:w="120" w:type="dxa"/>
+            </w:tcMar>
+            <w:vAlign w:val="center"/>
+            <w:shd w:fill="FBFCFD"/>
+          </w:tcPr>
+          <w:p>
+            <w:pPr>
+              <w:spacing w:after="0" w:line="276" w:lineRule="auto"/>
+            </w:pPr>
+            <w:r/>
+            <w:r>
+              <w:rPr>
+                <w:b w:val="0"/>
+                <w:sz w:val="18"/>
+              </w:rPr>
+              <w:t>0.5356</w:t>
+            </w:r>
+          </w:p>
+        </w:tc>
+        <w:tc>
+          <w:tcPr>
+            <w:tcW w:type="dxa" w:w="850"/>
+            <w:tcMar>
+              <w:top w:w="80" w:type="dxa"/>
+              <w:start w:w="120" w:type="dxa"/>
+              <w:bottom w:w="80" w:type="dxa"/>
+              <w:end w:w="120" w:type="dxa"/>
+            </w:tcMar>
+            <w:vAlign w:val="center"/>
+            <w:shd w:fill="FBFCFD"/>
+          </w:tcPr>
+          <w:p>
+            <w:pPr>
+              <w:spacing w:after="0" w:line="276" w:lineRule="auto"/>
+            </w:pPr>
+            <w:r/>
+            <w:r>
+              <w:rPr>
+                <w:b w:val="0"/>
+                <w:sz w:val="18"/>
+              </w:rPr>
+              <w:t>0.6274</w:t>
             </w:r>
           </w:p>
         </w:tc>
@@ -8053,6 +9505,7 @@
               <w:end w:w="120" w:type="dxa"/>
             </w:tcMar>
             <w:vAlign w:val="center"/>
+            <w:shd w:fill="FBFCFD"/>
           </w:tcPr>
           <w:p>
             <w:pPr>
@@ -8064,20 +9517,21 @@
                 <w:b w:val="0"/>
                 <w:sz w:val="18"/>
               </w:rPr>
-              <w:t>0.5134</w:t>
-            </w:r>
-          </w:p>
-        </w:tc>
-        <w:tc>
-          <w:tcPr>
-            <w:tcW w:type="dxa" w:w="1400"/>
-            <w:tcMar>
-              <w:top w:w="80" w:type="dxa"/>
-              <w:start w:w="120" w:type="dxa"/>
-              <w:bottom w:w="80" w:type="dxa"/>
-              <w:end w:w="120" w:type="dxa"/>
-            </w:tcMar>
-            <w:vAlign w:val="center"/>
+              <w:t>0.9043</w:t>
+            </w:r>
+          </w:p>
+        </w:tc>
+        <w:tc>
+          <w:tcPr>
+            <w:tcW w:type="dxa" w:w="1460"/>
+            <w:tcMar>
+              <w:top w:w="80" w:type="dxa"/>
+              <w:start w:w="120" w:type="dxa"/>
+              <w:bottom w:w="80" w:type="dxa"/>
+              <w:end w:w="120" w:type="dxa"/>
+            </w:tcMar>
+            <w:vAlign w:val="center"/>
+            <w:shd w:fill="FBFCFD"/>
           </w:tcPr>
           <w:p>
             <w:pPr>
@@ -8089,13 +9543,15 @@
                 <w:b w:val="0"/>
                 <w:sz w:val="18"/>
               </w:rPr>
-              <w:t>0.9004</w:t>
-            </w:r>
-          </w:p>
-        </w:tc>
-        <w:tc>
-          <w:tcPr>
-            <w:tcW w:type="dxa" w:w="800"/>
+              <w:t>617 / 198 / 535</w:t>
+            </w:r>
+          </w:p>
+        </w:tc>
+      </w:tr>
+      <w:tr>
+        <w:tc>
+          <w:tcPr>
+            <w:tcW w:type="dxa" w:w="3000"/>
             <w:tcMar>
               <w:top w:w="80" w:type="dxa"/>
               <w:start w:w="120" w:type="dxa"/>
@@ -8114,13 +9570,13 @@
                 <w:b w:val="0"/>
                 <w:sz w:val="18"/>
               </w:rPr>
-              <w:t>134</w:t>
-            </w:r>
-          </w:p>
-        </w:tc>
-        <w:tc>
-          <w:tcPr>
-            <w:tcW w:type="dxa" w:w="800"/>
+              <w:t>YOLO conf=0.40 precision sweep</w:t>
+            </w:r>
+          </w:p>
+        </w:tc>
+        <w:tc>
+          <w:tcPr>
+            <w:tcW w:type="dxa" w:w="850"/>
             <w:tcMar>
               <w:top w:w="80" w:type="dxa"/>
               <w:start w:w="120" w:type="dxa"/>
@@ -8139,13 +9595,13 @@
                 <w:b w:val="0"/>
                 <w:sz w:val="18"/>
               </w:rPr>
-              <w:t>42</w:t>
-            </w:r>
-          </w:p>
-        </w:tc>
-        <w:tc>
-          <w:tcPr>
-            <w:tcW w:type="dxa" w:w="960"/>
+              <w:t>300</w:t>
+            </w:r>
+          </w:p>
+        </w:tc>
+        <w:tc>
+          <w:tcPr>
+            <w:tcW w:type="dxa" w:w="1000"/>
             <w:tcMar>
               <w:top w:w="80" w:type="dxa"/>
               <w:start w:w="120" w:type="dxa"/>
@@ -8164,7 +9620,107 @@
                 <w:b w:val="0"/>
                 <w:sz w:val="18"/>
               </w:rPr>
-              <w:t>127</w:t>
+              <w:t>0.8035</w:t>
+            </w:r>
+          </w:p>
+        </w:tc>
+        <w:tc>
+          <w:tcPr>
+            <w:tcW w:type="dxa" w:w="1000"/>
+            <w:tcMar>
+              <w:top w:w="80" w:type="dxa"/>
+              <w:start w:w="120" w:type="dxa"/>
+              <w:bottom w:w="80" w:type="dxa"/>
+              <w:end w:w="120" w:type="dxa"/>
+            </w:tcMar>
+            <w:vAlign w:val="center"/>
+          </w:tcPr>
+          <w:p>
+            <w:pPr>
+              <w:spacing w:after="0" w:line="276" w:lineRule="auto"/>
+            </w:pPr>
+            <w:r/>
+            <w:r>
+              <w:rPr>
+                <w:b w:val="0"/>
+                <w:sz w:val="18"/>
+              </w:rPr>
+              <w:t>0.5148</w:t>
+            </w:r>
+          </w:p>
+        </w:tc>
+        <w:tc>
+          <w:tcPr>
+            <w:tcW w:type="dxa" w:w="850"/>
+            <w:tcMar>
+              <w:top w:w="80" w:type="dxa"/>
+              <w:start w:w="120" w:type="dxa"/>
+              <w:bottom w:w="80" w:type="dxa"/>
+              <w:end w:w="120" w:type="dxa"/>
+            </w:tcMar>
+            <w:vAlign w:val="center"/>
+          </w:tcPr>
+          <w:p>
+            <w:pPr>
+              <w:spacing w:after="0" w:line="276" w:lineRule="auto"/>
+            </w:pPr>
+            <w:r/>
+            <w:r>
+              <w:rPr>
+                <w:b w:val="0"/>
+                <w:sz w:val="18"/>
+              </w:rPr>
+              <w:t>0.6275</w:t>
+            </w:r>
+          </w:p>
+        </w:tc>
+        <w:tc>
+          <w:tcPr>
+            <w:tcW w:type="dxa" w:w="1200"/>
+            <w:tcMar>
+              <w:top w:w="80" w:type="dxa"/>
+              <w:start w:w="120" w:type="dxa"/>
+              <w:bottom w:w="80" w:type="dxa"/>
+              <w:end w:w="120" w:type="dxa"/>
+            </w:tcMar>
+            <w:vAlign w:val="center"/>
+          </w:tcPr>
+          <w:p>
+            <w:pPr>
+              <w:spacing w:after="0" w:line="276" w:lineRule="auto"/>
+            </w:pPr>
+            <w:r/>
+            <w:r>
+              <w:rPr>
+                <w:b w:val="0"/>
+                <w:sz w:val="18"/>
+              </w:rPr>
+              <w:t>0.9050</w:t>
+            </w:r>
+          </w:p>
+        </w:tc>
+        <w:tc>
+          <w:tcPr>
+            <w:tcW w:type="dxa" w:w="1460"/>
+            <w:tcMar>
+              <w:top w:w="80" w:type="dxa"/>
+              <w:start w:w="120" w:type="dxa"/>
+              <w:bottom w:w="80" w:type="dxa"/>
+              <w:end w:w="120" w:type="dxa"/>
+            </w:tcMar>
+            <w:vAlign w:val="center"/>
+          </w:tcPr>
+          <w:p>
+            <w:pPr>
+              <w:spacing w:after="0" w:line="276" w:lineRule="auto"/>
+            </w:pPr>
+            <w:r/>
+            <w:r>
+              <w:rPr>
+                <w:b w:val="0"/>
+                <w:sz w:val="18"/>
+              </w:rPr>
+              <w:t>593 / 145 / 559</w:t>
             </w:r>
           </w:p>
         </w:tc>
@@ -8221,7 +9777,7 @@
                 <w:color w:val="0B2545"/>
                 <w:sz w:val="20"/>
               </w:rPr>
-              <w:t>`--localizer yolo --yolo-conf 0.35` gives the best quick-check balance: higher precision, still useful recall, and high localization IoU.</w:t>
+              <w:t>`--localizer yolo --yolo-conf 0.30` is the promoted balanced setting from the 300-image sweep: best F1/recall among tested thresholds and mean matched IoU above 0.90. Use `conf=0.40` only when the report wants the highest precision trade-off.</w:t>
             </w:r>
           </w:p>
         </w:tc>
@@ -8278,7 +9834,7 @@
           <w:color w:val="555555"/>
           <w:sz w:val="18"/>
         </w:rPr>
-        <w:t>Figure 5. Example classification-first / YOLO localization-only output.</w:t>
+        <w:t>Figure 5. Example localization-first crop-verification output.</w:t>
       </w:r>
     </w:p>
     <w:p>
@@ -8286,362 +9842,7 @@
         <w:pStyle w:val="Heading1"/>
       </w:pPr>
       <w:r>
-        <w:t>7. Mobile Application Tracking</w:t>
-      </w:r>
-    </w:p>
-    <w:tbl>
-      <w:tblPr>
-        <w:tblStyle w:val="TableGrid"/>
-        <w:tblW w:type="dxa" w:w="9360"/>
-        <w:jc w:val="left"/>
-        <w:tblLook w:firstColumn="1" w:firstRow="1" w:lastColumn="0" w:lastRow="0" w:noHBand="0" w:noVBand="1" w:val="04A0"/>
-        <w:tblInd w:w="120" w:type="dxa"/>
-      </w:tblPr>
-      <w:tblGrid>
-        <w:gridCol w:w="2400"/>
-        <w:gridCol w:w="6960"/>
-      </w:tblGrid>
-      <w:tr>
-        <w:trPr>
-          <w:tblHeader w:val="true"/>
-        </w:trPr>
-        <w:tc>
-          <w:tcPr>
-            <w:tcW w:type="dxa" w:w="2400"/>
-            <w:tcMar>
-              <w:top w:w="80" w:type="dxa"/>
-              <w:start w:w="120" w:type="dxa"/>
-              <w:bottom w:w="80" w:type="dxa"/>
-              <w:end w:w="120" w:type="dxa"/>
-            </w:tcMar>
-            <w:vAlign w:val="center"/>
-            <w:shd w:fill="E8EEF5"/>
-          </w:tcPr>
-          <w:p>
-            <w:pPr>
-              <w:spacing w:after="0" w:line="276" w:lineRule="auto"/>
-            </w:pPr>
-            <w:r>
-              <w:rPr>
-                <w:b/>
-                <w:color w:val="0B2545"/>
-              </w:rPr>
-            </w:r>
-            <w:r>
-              <w:rPr>
-                <w:b/>
-                <w:color w:val="0B2545"/>
-                <w:sz w:val="18"/>
-              </w:rPr>
-              <w:t>Component</w:t>
-            </w:r>
-          </w:p>
-        </w:tc>
-        <w:tc>
-          <w:tcPr>
-            <w:tcW w:type="dxa" w:w="6960"/>
-            <w:tcMar>
-              <w:top w:w="80" w:type="dxa"/>
-              <w:start w:w="120" w:type="dxa"/>
-              <w:bottom w:w="80" w:type="dxa"/>
-              <w:end w:w="120" w:type="dxa"/>
-            </w:tcMar>
-            <w:vAlign w:val="center"/>
-            <w:shd w:fill="E8EEF5"/>
-          </w:tcPr>
-          <w:p>
-            <w:pPr>
-              <w:spacing w:after="0" w:line="276" w:lineRule="auto"/>
-            </w:pPr>
-            <w:r>
-              <w:rPr>
-                <w:b/>
-                <w:color w:val="0B2545"/>
-              </w:rPr>
-            </w:r>
-            <w:r>
-              <w:rPr>
-                <w:b/>
-                <w:color w:val="0B2545"/>
-                <w:sz w:val="18"/>
-              </w:rPr>
-              <w:t>Status</w:t>
-            </w:r>
-          </w:p>
-        </w:tc>
-      </w:tr>
-      <w:tr>
-        <w:tc>
-          <w:tcPr>
-            <w:tcW w:type="dxa" w:w="2400"/>
-            <w:tcMar>
-              <w:top w:w="80" w:type="dxa"/>
-              <w:start w:w="120" w:type="dxa"/>
-              <w:bottom w:w="80" w:type="dxa"/>
-              <w:end w:w="120" w:type="dxa"/>
-            </w:tcMar>
-            <w:vAlign w:val="center"/>
-          </w:tcPr>
-          <w:p>
-            <w:pPr>
-              <w:spacing w:after="0" w:line="276" w:lineRule="auto"/>
-            </w:pPr>
-            <w:r/>
-            <w:r>
-              <w:rPr>
-                <w:b w:val="0"/>
-                <w:sz w:val="18"/>
-              </w:rPr>
-              <w:t>Framework</w:t>
-            </w:r>
-          </w:p>
-        </w:tc>
-        <w:tc>
-          <w:tcPr>
-            <w:tcW w:type="dxa" w:w="6960"/>
-            <w:tcMar>
-              <w:top w:w="80" w:type="dxa"/>
-              <w:start w:w="120" w:type="dxa"/>
-              <w:bottom w:w="80" w:type="dxa"/>
-              <w:end w:w="120" w:type="dxa"/>
-            </w:tcMar>
-            <w:vAlign w:val="center"/>
-          </w:tcPr>
-          <w:p>
-            <w:pPr>
-              <w:spacing w:after="0" w:line="276" w:lineRule="auto"/>
-            </w:pPr>
-            <w:r/>
-            <w:r>
-              <w:rPr>
-                <w:b w:val="0"/>
-                <w:sz w:val="18"/>
-              </w:rPr>
-              <w:t>Expo Dev Client / React Native mobile app in `mobile/`.</w:t>
-            </w:r>
-          </w:p>
-        </w:tc>
-      </w:tr>
-      <w:tr>
-        <w:tc>
-          <w:tcPr>
-            <w:tcW w:type="dxa" w:w="2400"/>
-            <w:tcMar>
-              <w:top w:w="80" w:type="dxa"/>
-              <w:start w:w="120" w:type="dxa"/>
-              <w:bottom w:w="80" w:type="dxa"/>
-              <w:end w:w="120" w:type="dxa"/>
-            </w:tcMar>
-            <w:vAlign w:val="center"/>
-            <w:shd w:fill="FBFCFD"/>
-          </w:tcPr>
-          <w:p>
-            <w:pPr>
-              <w:spacing w:after="0" w:line="276" w:lineRule="auto"/>
-            </w:pPr>
-            <w:r/>
-            <w:r>
-              <w:rPr>
-                <w:b w:val="0"/>
-                <w:sz w:val="18"/>
-              </w:rPr>
-              <w:t>Inference</w:t>
-            </w:r>
-          </w:p>
-        </w:tc>
-        <w:tc>
-          <w:tcPr>
-            <w:tcW w:type="dxa" w:w="6960"/>
-            <w:tcMar>
-              <w:top w:w="80" w:type="dxa"/>
-              <w:start w:w="120" w:type="dxa"/>
-              <w:bottom w:w="80" w:type="dxa"/>
-              <w:end w:w="120" w:type="dxa"/>
-            </w:tcMar>
-            <w:vAlign w:val="center"/>
-            <w:shd w:fill="FBFCFD"/>
-          </w:tcPr>
-          <w:p>
-            <w:pPr>
-              <w:spacing w:after="0" w:line="276" w:lineRule="auto"/>
-            </w:pPr>
-            <w:r/>
-            <w:r>
-              <w:rPr>
-                <w:b w:val="0"/>
-                <w:sz w:val="18"/>
-              </w:rPr>
-              <w:t>Vision Camera + `react-native-fast-tflite` + YOLO post-processing.</w:t>
-            </w:r>
-          </w:p>
-        </w:tc>
-      </w:tr>
-      <w:tr>
-        <w:tc>
-          <w:tcPr>
-            <w:tcW w:type="dxa" w:w="2400"/>
-            <w:tcMar>
-              <w:top w:w="80" w:type="dxa"/>
-              <w:start w:w="120" w:type="dxa"/>
-              <w:bottom w:w="80" w:type="dxa"/>
-              <w:end w:w="120" w:type="dxa"/>
-            </w:tcMar>
-            <w:vAlign w:val="center"/>
-          </w:tcPr>
-          <w:p>
-            <w:pPr>
-              <w:spacing w:after="0" w:line="276" w:lineRule="auto"/>
-            </w:pPr>
-            <w:r/>
-            <w:r>
-              <w:rPr>
-                <w:b w:val="0"/>
-                <w:sz w:val="18"/>
-              </w:rPr>
-              <w:t>Model assets</w:t>
-            </w:r>
-          </w:p>
-        </w:tc>
-        <w:tc>
-          <w:tcPr>
-            <w:tcW w:type="dxa" w:w="6960"/>
-            <w:tcMar>
-              <w:top w:w="80" w:type="dxa"/>
-              <w:start w:w="120" w:type="dxa"/>
-              <w:bottom w:w="80" w:type="dxa"/>
-              <w:end w:w="120" w:type="dxa"/>
-            </w:tcMar>
-            <w:vAlign w:val="center"/>
-          </w:tcPr>
-          <w:p>
-            <w:pPr>
-              <w:spacing w:after="0" w:line="276" w:lineRule="auto"/>
-            </w:pPr>
-            <w:r/>
-            <w:r>
-              <w:rPr>
-                <w:b w:val="0"/>
-                <w:sz w:val="18"/>
-              </w:rPr>
-              <w:t>`best_float16.tflite`, `best_float32.tflite`, `best_metadata.json`.</w:t>
-            </w:r>
-          </w:p>
-        </w:tc>
-      </w:tr>
-      <w:tr>
-        <w:tc>
-          <w:tcPr>
-            <w:tcW w:type="dxa" w:w="2400"/>
-            <w:tcMar>
-              <w:top w:w="80" w:type="dxa"/>
-              <w:start w:w="120" w:type="dxa"/>
-              <w:bottom w:w="80" w:type="dxa"/>
-              <w:end w:w="120" w:type="dxa"/>
-            </w:tcMar>
-            <w:vAlign w:val="center"/>
-            <w:shd w:fill="FBFCFD"/>
-          </w:tcPr>
-          <w:p>
-            <w:pPr>
-              <w:spacing w:after="0" w:line="276" w:lineRule="auto"/>
-            </w:pPr>
-            <w:r/>
-            <w:r>
-              <w:rPr>
-                <w:b w:val="0"/>
-                <w:sz w:val="18"/>
-              </w:rPr>
-              <w:t>User features</w:t>
-            </w:r>
-          </w:p>
-        </w:tc>
-        <w:tc>
-          <w:tcPr>
-            <w:tcW w:type="dxa" w:w="6960"/>
-            <w:tcMar>
-              <w:top w:w="80" w:type="dxa"/>
-              <w:start w:w="120" w:type="dxa"/>
-              <w:bottom w:w="80" w:type="dxa"/>
-              <w:end w:w="120" w:type="dxa"/>
-            </w:tcMar>
-            <w:vAlign w:val="center"/>
-            <w:shd w:fill="FBFCFD"/>
-          </w:tcPr>
-          <w:p>
-            <w:pPr>
-              <w:spacing w:after="0" w:line="276" w:lineRule="auto"/>
-            </w:pPr>
-            <w:r/>
-            <w:r>
-              <w:rPr>
-                <w:b w:val="0"/>
-                <w:sz w:val="18"/>
-              </w:rPr>
-              <w:t>Live scan, result page, history, settings, sorting guidance, leaderboard skeleton.</w:t>
-            </w:r>
-          </w:p>
-        </w:tc>
-      </w:tr>
-      <w:tr>
-        <w:tc>
-          <w:tcPr>
-            <w:tcW w:type="dxa" w:w="2400"/>
-            <w:tcMar>
-              <w:top w:w="80" w:type="dxa"/>
-              <w:start w:w="120" w:type="dxa"/>
-              <w:bottom w:w="80" w:type="dxa"/>
-              <w:end w:w="120" w:type="dxa"/>
-            </w:tcMar>
-            <w:vAlign w:val="center"/>
-          </w:tcPr>
-          <w:p>
-            <w:pPr>
-              <w:spacing w:after="0" w:line="276" w:lineRule="auto"/>
-            </w:pPr>
-            <w:r/>
-            <w:r>
-              <w:rPr>
-                <w:b w:val="0"/>
-                <w:sz w:val="18"/>
-              </w:rPr>
-              <w:t>Validation gap</w:t>
-            </w:r>
-          </w:p>
-        </w:tc>
-        <w:tc>
-          <w:tcPr>
-            <w:tcW w:type="dxa" w:w="6960"/>
-            <w:tcMar>
-              <w:top w:w="80" w:type="dxa"/>
-              <w:start w:w="120" w:type="dxa"/>
-              <w:bottom w:w="80" w:type="dxa"/>
-              <w:end w:w="120" w:type="dxa"/>
-            </w:tcMar>
-            <w:vAlign w:val="center"/>
-          </w:tcPr>
-          <w:p>
-            <w:pPr>
-              <w:spacing w:after="0" w:line="276" w:lineRule="auto"/>
-            </w:pPr>
-            <w:r/>
-            <w:r>
-              <w:rPr>
-                <w:b w:val="0"/>
-                <w:sz w:val="18"/>
-              </w:rPr>
-              <w:t>Physical Android device or emulator runtime validation still required.</w:t>
-            </w:r>
-          </w:p>
-        </w:tc>
-      </w:tr>
-    </w:tbl>
-    <w:p/>
-    <w:p>
-      <w:pPr>
-        <w:pStyle w:val="Heading1"/>
-      </w:pPr>
-      <w:r>
-        <w:t>8. Reproducible Commands</w:t>
+        <w:t>7. Reproducible Commands</w:t>
       </w:r>
     </w:p>
     <w:tbl>
@@ -8747,7 +9948,7 @@
                 <w:b w:val="0"/>
                 <w:sz w:val="18"/>
               </w:rPr>
-              <w:t>Feature ML run</w:t>
+              <w:t>Current feature ML run</w:t>
             </w:r>
           </w:p>
         </w:tc>
@@ -8772,7 +9973,7 @@
                 <w:b w:val="0"/>
                 <w:sz w:val="18"/>
               </w:rPr>
-              <w:t>.\.venv311\Scripts\python.exe scripts\feature_ml_analysis.py --data merged_dataset_v3\data.yaml --out runs\ml\feature_ml_lecturer_6class_4k --exclude-classes other --max-per-class-train 4000 --max-per-class-test 800</w:t>
+              <w:t>.\.venv311\Scripts\python.exe scripts\feature_ml_analysis.py --data external_datasets\super_yolo_dataset\data.yaml --out runs\ml\feature_ml_super_yolo_6class_4k --exclude-classes= --max-per-class-train 4000 --max-per-class-test 800 --domain-out runs\ml\feature_ml_super_yolo_6class_4k\frequency_analysis</w:t>
             </w:r>
           </w:p>
         </w:tc>
@@ -8800,7 +10001,7 @@
                 <w:b w:val="0"/>
                 <w:sz w:val="18"/>
               </w:rPr>
-              <w:t>Current YOLO dataset</w:t>
+              <w:t>Legacy feature ML run</w:t>
             </w:r>
           </w:p>
         </w:tc>
@@ -8826,7 +10027,7 @@
                 <w:b w:val="0"/>
                 <w:sz w:val="18"/>
               </w:rPr>
-              <w:t>external_datasets\super_yolo_dataset\data.yaml</w:t>
+              <w:t>.\.venv311\Scripts\python.exe scripts\feature_ml_analysis.py --data merged_dataset_v3\data.yaml --out runs\ml\feature_ml_lecturer_6class_4k --exclude-classes other --max-per-class-train 4000 --max-per-class-test 800</w:t>
             </w:r>
           </w:p>
         </w:tc>
@@ -8853,7 +10054,7 @@
                 <w:b w:val="0"/>
                 <w:sz w:val="18"/>
               </w:rPr>
-              <w:t>Current classification dataset</w:t>
+              <w:t>Current YOLO dataset</w:t>
             </w:r>
           </w:p>
         </w:tc>
@@ -8878,7 +10079,7 @@
                 <w:b w:val="0"/>
                 <w:sz w:val="18"/>
               </w:rPr>
-              <w:t>data\merged_dataset_v5\data.yaml</w:t>
+              <w:t>external_datasets\super_yolo_dataset\data.yaml</w:t>
             </w:r>
           </w:p>
         </w:tc>
@@ -8906,7 +10107,7 @@
                 <w:b w:val="0"/>
                 <w:sz w:val="18"/>
               </w:rPr>
-              <w:t>PCA experiment</w:t>
+              <w:t>Current classification dataset</w:t>
             </w:r>
           </w:p>
         </w:tc>
@@ -8932,7 +10133,7 @@
                 <w:b w:val="0"/>
                 <w:sz w:val="18"/>
               </w:rPr>
-              <w:t>.\.venv311\Scripts\python.exe scripts\train_pca_ann.py</w:t>
+              <w:t>data\merged_dataset_v5\data.yaml</w:t>
             </w:r>
           </w:p>
         </w:tc>
@@ -8959,7 +10160,7 @@
                 <w:b w:val="0"/>
                 <w:sz w:val="18"/>
               </w:rPr>
-              <w:t>DL localization rework</w:t>
+              <w:t>Controlled PCA model sweep</w:t>
             </w:r>
           </w:p>
         </w:tc>
@@ -8984,7 +10185,7 @@
                 <w:b w:val="0"/>
                 <w:sz w:val="18"/>
               </w:rPr>
-              <w:t>.\.venv311\Scripts\python.exe scripts\classification_to_localization_pipeline.py --max-images 60 --sample-mode stratified --seed 42 --localizer yolo --yolo-conf 0.35 --out-dir runs\dl\localization_rework\yolo_conf035_stratified60_final</w:t>
+              <w:t>.\.venv311\Scripts\python.exe scripts\pca_feature_model_sweep.py --out runs\ml\pca_feature_model_sweep --components 637 64 128 256 --seed 42</w:t>
             </w:r>
           </w:p>
         </w:tc>
@@ -9012,7 +10213,7 @@
                 <w:b w:val="0"/>
                 <w:sz w:val="18"/>
               </w:rPr>
-              <w:t>Mobile static check</w:t>
+              <w:t>Legacy ANN PCA experiment</w:t>
             </w:r>
           </w:p>
         </w:tc>
@@ -9038,7 +10239,59 @@
                 <w:b w:val="0"/>
                 <w:sz w:val="18"/>
               </w:rPr>
-              <w:t>cd mobile &amp;&amp; node .\node_modules\typescript\bin\tsc --noEmit</w:t>
+              <w:t>.\.venv311\Scripts\python.exe scripts\train_pca_ann.py</w:t>
+            </w:r>
+          </w:p>
+        </w:tc>
+      </w:tr>
+      <w:tr>
+        <w:tc>
+          <w:tcPr>
+            <w:tcW w:type="dxa" w:w="2200"/>
+            <w:tcMar>
+              <w:top w:w="80" w:type="dxa"/>
+              <w:start w:w="120" w:type="dxa"/>
+              <w:bottom w:w="80" w:type="dxa"/>
+              <w:end w:w="120" w:type="dxa"/>
+            </w:tcMar>
+            <w:vAlign w:val="center"/>
+          </w:tcPr>
+          <w:p>
+            <w:pPr>
+              <w:spacing w:after="0" w:line="276" w:lineRule="auto"/>
+            </w:pPr>
+            <w:r/>
+            <w:r>
+              <w:rPr>
+                <w:b w:val="0"/>
+                <w:sz w:val="18"/>
+              </w:rPr>
+              <w:t>DL localization rework</w:t>
+            </w:r>
+          </w:p>
+        </w:tc>
+        <w:tc>
+          <w:tcPr>
+            <w:tcW w:type="dxa" w:w="7160"/>
+            <w:tcMar>
+              <w:top w:w="80" w:type="dxa"/>
+              <w:start w:w="120" w:type="dxa"/>
+              <w:bottom w:w="80" w:type="dxa"/>
+              <w:end w:w="120" w:type="dxa"/>
+            </w:tcMar>
+            <w:vAlign w:val="center"/>
+          </w:tcPr>
+          <w:p>
+            <w:pPr>
+              <w:spacing w:after="0" w:line="276" w:lineRule="auto"/>
+            </w:pPr>
+            <w:r/>
+            <w:r>
+              <w:rPr>
+                <w:b w:val="0"/>
+                <w:sz w:val="18"/>
+              </w:rPr>
+              <w:t>.\.venv311\Scripts\python.exe scripts\classification_to_localization_pipeline.py --max-images 300 --max-visuals 24 --sample-mode stratified --seed 42 --localizer yolo --yolo-conf 0.30 --out-dir runs\dl\localization_rework\yolo_conf030_stratified300_final</w:t>
             </w:r>
           </w:p>
         </w:tc>
@@ -9050,7 +10303,7 @@
         <w:pStyle w:val="Heading1"/>
       </w:pPr>
       <w:r>
-        <w:t>9. Artifact Index</w:t>
+        <w:t>8. Artifact Index</w:t>
       </w:r>
     </w:p>
     <w:tbl>
@@ -9368,7 +10621,7 @@
                 <w:b w:val="0"/>
                 <w:sz w:val="18"/>
               </w:rPr>
-              <w:t>ML lecturer run</w:t>
+              <w:t>Current ML rerun</w:t>
             </w:r>
           </w:p>
         </w:tc>
@@ -9393,7 +10646,7 @@
                 <w:b w:val="0"/>
                 <w:sz w:val="18"/>
               </w:rPr>
-              <w:t>runs\ml\feature_ml_lecturer_6class_4k\REPORT.md</w:t>
+              <w:t>runs\ml\feature_ml_super_yolo_6class_4k\REPORT.md</w:t>
             </w:r>
           </w:p>
         </w:tc>
@@ -9421,7 +10674,7 @@
                 <w:b w:val="0"/>
                 <w:sz w:val="18"/>
               </w:rPr>
-              <w:t>PCA report</w:t>
+              <w:t>Legacy ML lecturer run</w:t>
             </w:r>
           </w:p>
         </w:tc>
@@ -9447,7 +10700,7 @@
                 <w:b w:val="0"/>
                 <w:sz w:val="18"/>
               </w:rPr>
-              <w:t>runs\dl\pca_experiments\PCA_Dimensionality_Report.md</w:t>
+              <w:t>runs\ml\feature_ml_lecturer_6class_4k\REPORT.md</w:t>
             </w:r>
           </w:p>
         </w:tc>
@@ -9474,7 +10727,7 @@
                 <w:b w:val="0"/>
                 <w:sz w:val="18"/>
               </w:rPr>
-              <w:t>ML vs DL comparison</w:t>
+              <w:t>PCA model sweep</w:t>
             </w:r>
           </w:p>
         </w:tc>
@@ -9499,7 +10752,7 @@
                 <w:b w:val="0"/>
                 <w:sz w:val="18"/>
               </w:rPr>
-              <w:t>runs\comparisons\model_comparison\REPORT.md</w:t>
+              <w:t>runs\ml\pca_feature_model_sweep\PCA_Model_Sweep_Report.md</w:t>
             </w:r>
           </w:p>
         </w:tc>
@@ -9527,7 +10780,7 @@
                 <w:b w:val="0"/>
                 <w:sz w:val="18"/>
               </w:rPr>
-              <w:t>DL architecture comparison</w:t>
+              <w:t>Legacy ANN PCA report</w:t>
             </w:r>
           </w:p>
         </w:tc>
@@ -9553,7 +10806,7 @@
                 <w:b w:val="0"/>
                 <w:sz w:val="18"/>
               </w:rPr>
-              <w:t>runs\dl\comparison_models\model_comparison_report.md</w:t>
+              <w:t>runs\dl\pca_experiments\PCA_Dimensionality_Report.md</w:t>
             </w:r>
           </w:p>
         </w:tc>
@@ -9580,7 +10833,7 @@
                 <w:b w:val="0"/>
                 <w:sz w:val="18"/>
               </w:rPr>
-              <w:t>DL localization improved</w:t>
+              <w:t>ML vs DL comparison</w:t>
             </w:r>
           </w:p>
         </w:tc>
@@ -9605,7 +10858,7 @@
                 <w:b w:val="0"/>
                 <w:sz w:val="18"/>
               </w:rPr>
-              <w:t>runs\dl\localization_rework\yolo_conf035_stratified60_final\REPORT.md</w:t>
+              <w:t>runs\comparisons\model_comparison\REPORT.md</w:t>
             </w:r>
           </w:p>
         </w:tc>
@@ -9633,7 +10886,7 @@
                 <w:b w:val="0"/>
                 <w:sz w:val="18"/>
               </w:rPr>
-              <w:t>Mobile model assets</w:t>
+              <w:t>DL architecture comparison</w:t>
             </w:r>
           </w:p>
         </w:tc>
@@ -9659,7 +10912,59 @@
                 <w:b w:val="0"/>
                 <w:sz w:val="18"/>
               </w:rPr>
-              <w:t>mobile\assets\model</w:t>
+              <w:t>runs\dl\comparison_models\model_comparison_report.md</w:t>
+            </w:r>
+          </w:p>
+        </w:tc>
+      </w:tr>
+      <w:tr>
+        <w:tc>
+          <w:tcPr>
+            <w:tcW w:type="dxa" w:w="2700"/>
+            <w:tcMar>
+              <w:top w:w="80" w:type="dxa"/>
+              <w:start w:w="120" w:type="dxa"/>
+              <w:bottom w:w="80" w:type="dxa"/>
+              <w:end w:w="120" w:type="dxa"/>
+            </w:tcMar>
+            <w:vAlign w:val="center"/>
+          </w:tcPr>
+          <w:p>
+            <w:pPr>
+              <w:spacing w:after="0" w:line="276" w:lineRule="auto"/>
+            </w:pPr>
+            <w:r/>
+            <w:r>
+              <w:rPr>
+                <w:b w:val="0"/>
+                <w:sz w:val="18"/>
+              </w:rPr>
+              <w:t>DL localization improved</w:t>
+            </w:r>
+          </w:p>
+        </w:tc>
+        <w:tc>
+          <w:tcPr>
+            <w:tcW w:type="dxa" w:w="6660"/>
+            <w:tcMar>
+              <w:top w:w="80" w:type="dxa"/>
+              <w:start w:w="120" w:type="dxa"/>
+              <w:bottom w:w="80" w:type="dxa"/>
+              <w:end w:w="120" w:type="dxa"/>
+            </w:tcMar>
+            <w:vAlign w:val="center"/>
+          </w:tcPr>
+          <w:p>
+            <w:pPr>
+              <w:spacing w:after="0" w:line="276" w:lineRule="auto"/>
+            </w:pPr>
+            <w:r/>
+            <w:r>
+              <w:rPr>
+                <w:b w:val="0"/>
+                <w:sz w:val="18"/>
+              </w:rPr>
+              <w:t>runs\dl\localization_rework\yolo_conf030_stratified300_final\REPORT.md</w:t>
             </w:r>
           </w:p>
         </w:tc>
@@ -9671,7 +10976,7 @@
         <w:pStyle w:val="Heading1"/>
       </w:pPr>
       <w:r>
-        <w:t>10. Next Actions</w:t>
+        <w:t>9. Next Actions</w:t>
       </w:r>
     </w:p>
     <w:p>
@@ -9679,7 +10984,7 @@
         <w:pStyle w:val="ListNumber"/>
       </w:pPr>
       <w:r>
-        <w:t>Keep ML pipeline as the main explainable result and avoid changing its artifact paths unless rerunning all tables.</w:t>
+        <w:t>Use the newest `super_yolo_dataset` ML rerun for dataset-alignment claims, and label the stronger lecturer run as legacy evidence.</w:t>
       </w:r>
     </w:p>
     <w:p>
@@ -9687,7 +10992,7 @@
         <w:pStyle w:val="ListNumber"/>
       </w:pPr>
       <w:r>
-        <w:t>Decide whether to keep PCA artifact as-is or rerun if the final presentation must claim about 2% accuracy loss.</w:t>
+        <w:t>For PCA, cite the controlled Linear SVM row for the about-2% 637-to-128 claim and keep the ANN-only PCA result separate.</w:t>
       </w:r>
     </w:p>
     <w:p>
@@ -9695,15 +11000,7 @@
         <w:pStyle w:val="ListNumber"/>
       </w:pPr>
       <w:r>
-        <w:t>Use the classification-first YOLO-localization run for DL localization evidence.</w:t>
-      </w:r>
-    </w:p>
-    <w:p>
-      <w:pPr>
-        <w:pStyle w:val="ListNumber"/>
-      </w:pPr>
-      <w:r>
-        <w:t>Run mobile app on a physical Android device or emulator and record FPS, detection stability, and model toggle behavior.</w:t>
+        <w:t>Use the localization-first YOLO-localization run at conf=0.30 for final DL localization evidence.</w:t>
       </w:r>
     </w:p>
     <w:p>

</xml_diff>